<commit_message>
Báo cáo tiến độ word tuần 3
</commit_message>
<xml_diff>
--- a/DOCX/TTTN_MIS_04 - Quản lý khóa học hoặc sự kiện nội bộ.docx
+++ b/DOCX/TTTN_MIS_04 - Quản lý khóa học hoặc sự kiện nội bộ.docx
@@ -1,6 +1,6 @@
 
 <file path=word/document.xml><?xml version="1.0" encoding="utf-8"?>
-<w:document xmlns:wpc="http://schemas.microsoft.com/office/word/2010/wordprocessingCanvas" xmlns:cx="http://schemas.microsoft.com/office/drawing/2014/chartex" xmlns:cx1="http://schemas.microsoft.com/office/drawing/2015/9/8/chartex" xmlns:cx2="http://schemas.microsoft.com/office/drawing/2015/10/21/chartex" xmlns:cx3="http://schemas.microsoft.com/office/drawing/2016/5/9/chartex" xmlns:cx4="http://schemas.microsoft.com/office/drawing/2016/5/10/chartex" xmlns:cx5="http://schemas.microsoft.com/office/drawing/2016/5/11/chartex" xmlns:cx6="http://schemas.microsoft.com/office/drawing/2016/5/12/chartex" xmlns:cx7="http://schemas.microsoft.com/office/drawing/2016/5/13/chartex" xmlns:cx8="http://schemas.microsoft.com/office/drawing/2016/5/14/chartex" xmlns:mc="http://schemas.openxmlformats.org/markup-compatibility/2006" xmlns:aink="http://schemas.microsoft.com/office/drawing/2016/ink" xmlns:am3d="http://schemas.microsoft.com/office/drawing/2017/model3d" xmlns:o="urn:schemas-microsoft-com:office:office" xmlns:oel="http://schemas.microsoft.com/office/2019/extlst" xmlns:r="http://schemas.openxmlformats.org/officeDocument/2006/relationships" xmlns:m="http://schemas.openxmlformats.org/officeDocument/2006/math" xmlns:v="urn:schemas-microsoft-com:vml" xmlns:wp14="http://schemas.microsoft.com/office/word/2010/wordprocessingDrawing" xmlns:wp="http://schemas.openxmlformats.org/drawingml/2006/wordprocessingDrawing" xmlns:w10="urn:schemas-microsoft-com:office:word" xmlns:w="http://schemas.openxmlformats.org/wordprocessingml/2006/main" xmlns:w14="http://schemas.microsoft.com/office/word/2010/wordml" xmlns:w15="http://schemas.microsoft.com/office/word/2012/wordml" xmlns:w16cei="http://schemas.microsoft.com/office/word/2026/wordml/cei" xmlns:w16cex="http://schemas.microsoft.com/office/word/2018/wordml/cex" xmlns:w16cid="http://schemas.microsoft.com/office/word/2016/wordml/cid" xmlns:w16="http://schemas.microsoft.com/office/word/2018/wordml" xmlns:w16du="http://schemas.microsoft.com/office/word/2023/wordml/word16du" xmlns:w16sdtdh="http://schemas.microsoft.com/office/word/2020/wordml/sdtdatahash" xmlns:w16sdtfl="http://schemas.microsoft.com/office/word/2024/wordml/sdtformatlock" xmlns:w16se="http://schemas.microsoft.com/office/word/2015/wordml/symex" xmlns:wpg="http://schemas.microsoft.com/office/word/2010/wordprocessingGroup" xmlns:wpi="http://schemas.microsoft.com/office/word/2010/wordprocessingInk" xmlns:wne="http://schemas.microsoft.com/office/word/2006/wordml" xmlns:wps="http://schemas.microsoft.com/office/word/2010/wordprocessingShape" mc:Ignorable="w14 w15 w16se w16cid w16 w16cex w16sdtdh w16sdtfl w16du wp14">
+<w:document xmlns:wpc="http://schemas.microsoft.com/office/word/2010/wordprocessingCanvas" xmlns:cx="http://schemas.microsoft.com/office/drawing/2014/chartex" xmlns:cx1="http://schemas.microsoft.com/office/drawing/2015/9/8/chartex" xmlns:cx2="http://schemas.microsoft.com/office/drawing/2015/10/21/chartex" xmlns:cx3="http://schemas.microsoft.com/office/drawing/2016/5/9/chartex" xmlns:cx4="http://schemas.microsoft.com/office/drawing/2016/5/10/chartex" xmlns:cx5="http://schemas.microsoft.com/office/drawing/2016/5/11/chartex" xmlns:cx6="http://schemas.microsoft.com/office/drawing/2016/5/12/chartex" xmlns:cx7="http://schemas.microsoft.com/office/drawing/2016/5/13/chartex" xmlns:cx8="http://schemas.microsoft.com/office/drawing/2016/5/14/chartex" xmlns:mc="http://schemas.openxmlformats.org/markup-compatibility/2006" xmlns:aink="http://schemas.microsoft.com/office/drawing/2016/ink" xmlns:am3d="http://schemas.microsoft.com/office/drawing/2017/model3d" xmlns:o="urn:schemas-microsoft-com:office:office" xmlns:oel="http://schemas.microsoft.com/office/2019/extlst" xmlns:r="http://schemas.openxmlformats.org/officeDocument/2006/relationships" xmlns:m="http://schemas.openxmlformats.org/officeDocument/2006/math" xmlns:v="urn:schemas-microsoft-com:vml" xmlns:wp14="http://schemas.microsoft.com/office/word/2010/wordprocessingDrawing" xmlns:wp="http://schemas.openxmlformats.org/drawingml/2006/wordprocessingDrawing" xmlns:w10="urn:schemas-microsoft-com:office:word" xmlns:w="http://schemas.openxmlformats.org/wordprocessingml/2006/main" xmlns:w14="http://schemas.microsoft.com/office/word/2010/wordml" xmlns:w15="http://schemas.microsoft.com/office/word/2012/wordml" xmlns:w16cex="http://schemas.microsoft.com/office/word/2018/wordml/cex" xmlns:w16cid="http://schemas.microsoft.com/office/word/2016/wordml/cid" xmlns:w16="http://schemas.microsoft.com/office/word/2018/wordml" xmlns:w16du="http://schemas.microsoft.com/office/word/2023/wordml/word16du" xmlns:w16sdtdh="http://schemas.microsoft.com/office/word/2020/wordml/sdtdatahash" xmlns:w16sdtfl="http://schemas.microsoft.com/office/word/2024/wordml/sdtformatlock" xmlns:w16se="http://schemas.microsoft.com/office/word/2015/wordml/symex" xmlns:wpg="http://schemas.microsoft.com/office/word/2010/wordprocessingGroup" xmlns:wpi="http://schemas.microsoft.com/office/word/2010/wordprocessingInk" xmlns:wne="http://schemas.microsoft.com/office/word/2006/wordml" xmlns:wps="http://schemas.microsoft.com/office/word/2010/wordprocessingShape" mc:Ignorable="w14 w15 w16se w16cid w16 w16cex w16sdtdh w16sdtfl w16du wp14">
   <w:body>
     <w:p>
       <w:pPr>
@@ -82,7 +82,7 @@
                     <pic:cNvPicPr preferRelativeResize="0"/>
                   </pic:nvPicPr>
                   <pic:blipFill>
-                    <a:blip r:embed="rId7"/>
+                    <a:blip r:embed="rId8"/>
                     <a:srcRect/>
                     <a:stretch>
                       <a:fillRect/>
@@ -1950,8 +1950,8 @@
           <w:szCs w:val="28"/>
         </w:rPr>
         <w:sectPr>
-          <w:footerReference w:type="default" r:id="rId8"/>
-          <w:headerReference w:type="first" r:id="rId9"/>
+          <w:footerReference w:type="default" r:id="rId9"/>
+          <w:headerReference w:type="first" r:id="rId10"/>
           <w:pgSz w:w="12240" w:h="15840"/>
           <w:pgMar w:top="1440" w:right="1440" w:bottom="1440" w:left="1440" w:header="720" w:footer="720" w:gutter="0"/>
           <w:pgNumType w:start="1"/>
@@ -18118,7 +18118,25 @@
           <w:sz w:val="28"/>
           <w:szCs w:val="28"/>
         </w:rPr>
-        <w:t>3.1.3. Sơ đồ Use Case tổng quát</w:t>
+        <w:t>3.</w:t>
+      </w:r>
+      <w:r>
+        <w:rPr>
+          <w:b/>
+          <w:bCs/>
+          <w:sz w:val="28"/>
+          <w:szCs w:val="28"/>
+        </w:rPr>
+        <w:t>2</w:t>
+      </w:r>
+      <w:r>
+        <w:rPr>
+          <w:b/>
+          <w:bCs/>
+          <w:sz w:val="28"/>
+          <w:szCs w:val="28"/>
+        </w:rPr>
+        <w:t>. Sơ đồ Use Case tổng quát</w:t>
       </w:r>
     </w:p>
     <w:p>
@@ -18158,7 +18176,7 @@
                     <pic:cNvPicPr/>
                   </pic:nvPicPr>
                   <pic:blipFill>
-                    <a:blip r:embed="rId10" cstate="print">
+                    <a:blip r:embed="rId11" cstate="print">
                       <a:extLst>
                         <a:ext uri="{28A0092B-C50C-407E-A947-70E740481C1C}">
                           <a14:useLocalDpi xmlns:a14="http://schemas.microsoft.com/office/drawing/2010/main" val="0"/>
@@ -18980,7 +18998,27 @@
           <w:lang w:val="vi-VN"/>
         </w:rPr>
         <w:lastRenderedPageBreak/>
-        <w:t xml:space="preserve">3.1.4. </w:t>
+        <w:t>3.</w:t>
+      </w:r>
+      <w:r>
+        <w:rPr>
+          <w:b/>
+          <w:bCs/>
+          <w:sz w:val="28"/>
+          <w:szCs w:val="28"/>
+          <w:lang w:val="en-US"/>
+        </w:rPr>
+        <w:t>3</w:t>
+      </w:r>
+      <w:r>
+        <w:rPr>
+          <w:b/>
+          <w:bCs/>
+          <w:sz w:val="28"/>
+          <w:szCs w:val="28"/>
+          <w:lang w:val="vi-VN"/>
+        </w:rPr>
+        <w:t xml:space="preserve">. </w:t>
       </w:r>
       <w:r>
         <w:rPr>
@@ -19039,7 +19077,7 @@
                     <pic:cNvPicPr/>
                   </pic:nvPicPr>
                   <pic:blipFill>
-                    <a:blip r:embed="rId11">
+                    <a:blip r:embed="rId12">
                       <a:extLst>
                         <a:ext uri="{28A0092B-C50C-407E-A947-70E740481C1C}">
                           <a14:useLocalDpi xmlns:a14="http://schemas.microsoft.com/office/drawing/2010/main" val="0"/>
@@ -19163,7 +19201,7 @@
           <w:szCs w:val="28"/>
         </w:rPr>
         <w:lastRenderedPageBreak/>
-        <w:t>3.1.</w:t>
+        <w:t>3.</w:t>
       </w:r>
       <w:r>
         <w:rPr>
@@ -19172,7 +19210,7 @@
           <w:sz w:val="28"/>
           <w:szCs w:val="28"/>
         </w:rPr>
-        <w:t>5</w:t>
+        <w:t>4</w:t>
       </w:r>
       <w:r>
         <w:rPr>
@@ -19239,7 +19277,7 @@
                     <pic:cNvPicPr/>
                   </pic:nvPicPr>
                   <pic:blipFill>
-                    <a:blip r:embed="rId12">
+                    <a:blip r:embed="rId13">
                       <a:extLst>
                         <a:ext uri="{28A0092B-C50C-407E-A947-70E740481C1C}">
                           <a14:useLocalDpi xmlns:a14="http://schemas.microsoft.com/office/drawing/2010/main" val="0"/>
@@ -19326,17 +19364,194 @@
           <w:tab w:val="left" w:pos="3708"/>
         </w:tabs>
         <w:spacing w:line="312" w:lineRule="auto"/>
+        <w:rPr>
+          <w:b/>
+          <w:bCs/>
+          <w:sz w:val="28"/>
+          <w:szCs w:val="28"/>
+          <w:lang w:val="vi-VN"/>
+        </w:rPr>
+      </w:pPr>
+      <w:r>
+        <w:rPr>
+          <w:b/>
+          <w:bCs/>
+          <w:sz w:val="28"/>
+          <w:szCs w:val="28"/>
+          <w:lang w:val="en-US"/>
+        </w:rPr>
+        <w:lastRenderedPageBreak/>
+        <w:t>3.5. Sơ</w:t>
+      </w:r>
+      <w:r>
+        <w:rPr>
+          <w:b/>
+          <w:bCs/>
+          <w:sz w:val="28"/>
+          <w:szCs w:val="28"/>
+          <w:lang w:val="vi-VN"/>
+        </w:rPr>
+        <w:t xml:space="preserve"> đồ Activity</w:t>
+      </w:r>
+    </w:p>
+    <w:p>
+      <w:pPr>
+        <w:tabs>
+          <w:tab w:val="left" w:pos="3708"/>
+        </w:tabs>
+        <w:spacing w:line="312" w:lineRule="auto"/>
+        <w:rPr>
+          <w:b/>
+          <w:bCs/>
+          <w:sz w:val="28"/>
+          <w:szCs w:val="28"/>
+          <w:lang w:val="vi-VN"/>
+        </w:rPr>
+      </w:pPr>
+      <w:r>
+        <w:rPr>
+          <w:b/>
+          <w:bCs/>
+          <w:sz w:val="28"/>
+          <w:szCs w:val="28"/>
+          <w:lang w:val="vi-VN"/>
+        </w:rPr>
+        <w:t xml:space="preserve">Sơ đồ </w:t>
+      </w:r>
+      <w:r>
+        <w:rPr>
+          <w:b/>
+          <w:bCs/>
+          <w:sz w:val="28"/>
+          <w:szCs w:val="28"/>
+          <w:lang w:val="vi-VN"/>
+        </w:rPr>
+        <w:t xml:space="preserve">Activity </w:t>
+      </w:r>
+      <w:r>
+        <w:rPr>
+          <w:b/>
+          <w:bCs/>
+          <w:sz w:val="28"/>
+          <w:szCs w:val="28"/>
+          <w:lang w:val="vi-VN"/>
+        </w:rPr>
+        <w:t>-  Đăng k</w:t>
+      </w:r>
+      <w:r>
+        <w:rPr>
+          <w:b/>
+          <w:bCs/>
+          <w:sz w:val="28"/>
+          <w:szCs w:val="28"/>
+          <w:lang w:val="vi-VN"/>
+        </w:rPr>
+        <w:t>ý</w:t>
+      </w:r>
+    </w:p>
+    <w:p>
+      <w:pPr>
+        <w:tabs>
+          <w:tab w:val="left" w:pos="3708"/>
+        </w:tabs>
+        <w:spacing w:line="312" w:lineRule="auto"/>
+        <w:rPr>
+          <w:b/>
+          <w:bCs/>
+          <w:sz w:val="28"/>
+          <w:szCs w:val="28"/>
+          <w:lang w:val="vi-VN"/>
+        </w:rPr>
+      </w:pPr>
+    </w:p>
+    <w:p>
+      <w:pPr>
+        <w:tabs>
+          <w:tab w:val="left" w:pos="3708"/>
+        </w:tabs>
+        <w:spacing w:line="312" w:lineRule="auto"/>
+        <w:rPr>
+          <w:b/>
+          <w:bCs/>
+          <w:sz w:val="28"/>
+          <w:szCs w:val="28"/>
+          <w:lang w:val="vi-VN"/>
+        </w:rPr>
+      </w:pPr>
+    </w:p>
+    <w:p>
+      <w:pPr>
+        <w:tabs>
+          <w:tab w:val="left" w:pos="3708"/>
+        </w:tabs>
+        <w:spacing w:line="312" w:lineRule="auto"/>
         <w:ind w:left="720"/>
         <w:jc w:val="center"/>
         <w:rPr>
+          <w:b/>
+          <w:bCs/>
           <w:sz w:val="28"/>
           <w:szCs w:val="28"/>
           <w:lang w:val="vi-VN"/>
         </w:rPr>
       </w:pPr>
-    </w:p>
-    <w:p>
-      <w:pPr>
+      <w:r>
+        <w:rPr>
+          <w:b/>
+          <w:bCs/>
+          <w:noProof/>
+          <w:sz w:val="28"/>
+          <w:szCs w:val="28"/>
+          <w:lang w:val="vi-VN"/>
+        </w:rPr>
+        <w:drawing>
+          <wp:inline distT="0" distB="0" distL="0" distR="0" wp14:anchorId="11095222" wp14:editId="3F7DB694">
+            <wp:extent cx="5791835" cy="1706880"/>
+            <wp:effectExtent l="0" t="0" r="0" b="7620"/>
+            <wp:docPr id="88053735" name="Picture 2"/>
+            <wp:cNvGraphicFramePr>
+              <a:graphicFrameLocks xmlns:a="http://schemas.openxmlformats.org/drawingml/2006/main" noChangeAspect="1"/>
+            </wp:cNvGraphicFramePr>
+            <a:graphic xmlns:a="http://schemas.openxmlformats.org/drawingml/2006/main">
+              <a:graphicData uri="http://schemas.openxmlformats.org/drawingml/2006/picture">
+                <pic:pic xmlns:pic="http://schemas.openxmlformats.org/drawingml/2006/picture">
+                  <pic:nvPicPr>
+                    <pic:cNvPr id="88053735" name="Picture 88053735"/>
+                    <pic:cNvPicPr/>
+                  </pic:nvPicPr>
+                  <pic:blipFill>
+                    <a:blip r:embed="rId14">
+                      <a:extLst>
+                        <a:ext uri="{28A0092B-C50C-407E-A947-70E740481C1C}">
+                          <a14:useLocalDpi xmlns:a14="http://schemas.microsoft.com/office/drawing/2010/main" val="0"/>
+                        </a:ext>
+                      </a:extLst>
+                    </a:blip>
+                    <a:stretch>
+                      <a:fillRect/>
+                    </a:stretch>
+                  </pic:blipFill>
+                  <pic:spPr>
+                    <a:xfrm>
+                      <a:off x="0" y="0"/>
+                      <a:ext cx="5791835" cy="1706880"/>
+                    </a:xfrm>
+                    <a:prstGeom prst="rect">
+                      <a:avLst/>
+                    </a:prstGeom>
+                  </pic:spPr>
+                </pic:pic>
+              </a:graphicData>
+            </a:graphic>
+          </wp:inline>
+        </w:drawing>
+      </w:r>
+    </w:p>
+    <w:p>
+      <w:pPr>
+        <w:tabs>
+          <w:tab w:val="left" w:pos="3804"/>
+        </w:tabs>
         <w:spacing w:line="312" w:lineRule="auto"/>
         <w:ind w:firstLine="426"/>
         <w:jc w:val="center"/>
@@ -19346,29 +19561,249 @@
           <w:lang w:val="vi-VN"/>
         </w:rPr>
       </w:pPr>
+      <w:r>
+        <w:rPr>
+          <w:sz w:val="28"/>
+          <w:szCs w:val="28"/>
+          <w:lang w:val="vi-VN"/>
+        </w:rPr>
+        <w:t>Hình 3.4 Sơ đồ Activity – Đăng ký</w:t>
+      </w:r>
+    </w:p>
+    <w:p>
+      <w:pPr>
+        <w:tabs>
+          <w:tab w:val="left" w:pos="3804"/>
+        </w:tabs>
+        <w:spacing w:line="312" w:lineRule="auto"/>
+        <w:ind w:firstLine="426"/>
+        <w:jc w:val="center"/>
+        <w:rPr>
+          <w:sz w:val="28"/>
+          <w:szCs w:val="28"/>
+          <w:lang w:val="vi-VN"/>
+        </w:rPr>
+      </w:pPr>
+    </w:p>
+    <w:p>
+      <w:pPr>
+        <w:tabs>
+          <w:tab w:val="left" w:pos="3804"/>
+        </w:tabs>
+        <w:spacing w:line="312" w:lineRule="auto"/>
+        <w:rPr>
+          <w:b/>
+          <w:bCs/>
+          <w:sz w:val="28"/>
+          <w:szCs w:val="28"/>
+          <w:lang w:val="vi-VN"/>
+        </w:rPr>
+      </w:pPr>
+      <w:r>
+        <w:rPr>
+          <w:b/>
+          <w:bCs/>
+          <w:sz w:val="28"/>
+          <w:szCs w:val="28"/>
+          <w:lang w:val="vi-VN"/>
+        </w:rPr>
+        <w:t xml:space="preserve">Sơ đồ </w:t>
+      </w:r>
+      <w:r>
+        <w:rPr>
+          <w:b/>
+          <w:bCs/>
+          <w:sz w:val="28"/>
+          <w:szCs w:val="28"/>
+          <w:lang w:val="vi-VN"/>
+        </w:rPr>
+        <w:t>Activity</w:t>
+      </w:r>
+      <w:r>
+        <w:rPr>
+          <w:b/>
+          <w:bCs/>
+          <w:sz w:val="28"/>
+          <w:szCs w:val="28"/>
+          <w:lang w:val="vi-VN"/>
+        </w:rPr>
+        <w:t xml:space="preserve"> – </w:t>
+      </w:r>
+      <w:r>
+        <w:rPr>
+          <w:b/>
+          <w:bCs/>
+          <w:sz w:val="28"/>
+          <w:szCs w:val="28"/>
+          <w:lang w:val="vi-VN"/>
+        </w:rPr>
+        <w:t>Hủy đăng ký + Auto Promotion</w:t>
+      </w:r>
+    </w:p>
+    <w:p>
+      <w:pPr>
+        <w:tabs>
+          <w:tab w:val="left" w:pos="3804"/>
+        </w:tabs>
+        <w:spacing w:line="312" w:lineRule="auto"/>
+        <w:rPr>
+          <w:b/>
+          <w:bCs/>
+          <w:sz w:val="28"/>
+          <w:szCs w:val="28"/>
+          <w:lang w:val="vi-VN"/>
+        </w:rPr>
+      </w:pPr>
+    </w:p>
+    <w:p>
+      <w:pPr>
+        <w:tabs>
+          <w:tab w:val="left" w:pos="3804"/>
+        </w:tabs>
+        <w:spacing w:line="312" w:lineRule="auto"/>
+        <w:rPr>
+          <w:b/>
+          <w:bCs/>
+          <w:sz w:val="28"/>
+          <w:szCs w:val="28"/>
+          <w:lang w:val="vi-VN"/>
+        </w:rPr>
+      </w:pPr>
+    </w:p>
+    <w:p>
+      <w:pPr>
+        <w:tabs>
+          <w:tab w:val="left" w:pos="3804"/>
+        </w:tabs>
+        <w:spacing w:line="312" w:lineRule="auto"/>
+        <w:rPr>
+          <w:b/>
+          <w:bCs/>
+          <w:sz w:val="28"/>
+          <w:szCs w:val="28"/>
+          <w:lang w:val="vi-VN"/>
+        </w:rPr>
+      </w:pPr>
+      <w:r>
+        <w:rPr>
+          <w:b/>
+          <w:bCs/>
+          <w:noProof/>
+          <w:sz w:val="28"/>
+          <w:szCs w:val="28"/>
+          <w:lang w:val="vi-VN"/>
+        </w:rPr>
+        <w:drawing>
+          <wp:inline distT="0" distB="0" distL="0" distR="0" wp14:anchorId="10A73EBD" wp14:editId="79D73172">
+            <wp:extent cx="5791835" cy="2447925"/>
+            <wp:effectExtent l="0" t="0" r="0" b="9525"/>
+            <wp:docPr id="1690770380" name="Picture 3"/>
+            <wp:cNvGraphicFramePr>
+              <a:graphicFrameLocks xmlns:a="http://schemas.openxmlformats.org/drawingml/2006/main" noChangeAspect="1"/>
+            </wp:cNvGraphicFramePr>
+            <a:graphic xmlns:a="http://schemas.openxmlformats.org/drawingml/2006/main">
+              <a:graphicData uri="http://schemas.openxmlformats.org/drawingml/2006/picture">
+                <pic:pic xmlns:pic="http://schemas.openxmlformats.org/drawingml/2006/picture">
+                  <pic:nvPicPr>
+                    <pic:cNvPr id="1690770380" name="Picture 1690770380"/>
+                    <pic:cNvPicPr/>
+                  </pic:nvPicPr>
+                  <pic:blipFill>
+                    <a:blip r:embed="rId15" cstate="print">
+                      <a:extLst>
+                        <a:ext uri="{28A0092B-C50C-407E-A947-70E740481C1C}">
+                          <a14:useLocalDpi xmlns:a14="http://schemas.microsoft.com/office/drawing/2010/main" val="0"/>
+                        </a:ext>
+                      </a:extLst>
+                    </a:blip>
+                    <a:stretch>
+                      <a:fillRect/>
+                    </a:stretch>
+                  </pic:blipFill>
+                  <pic:spPr>
+                    <a:xfrm>
+                      <a:off x="0" y="0"/>
+                      <a:ext cx="5791835" cy="2447925"/>
+                    </a:xfrm>
+                    <a:prstGeom prst="rect">
+                      <a:avLst/>
+                    </a:prstGeom>
+                  </pic:spPr>
+                </pic:pic>
+              </a:graphicData>
+            </a:graphic>
+          </wp:inline>
+        </w:drawing>
+      </w:r>
+    </w:p>
+    <w:p>
+      <w:pPr>
+        <w:tabs>
+          <w:tab w:val="left" w:pos="3804"/>
+        </w:tabs>
+        <w:spacing w:line="312" w:lineRule="auto"/>
+        <w:jc w:val="center"/>
+        <w:rPr>
+          <w:sz w:val="28"/>
+          <w:szCs w:val="28"/>
+          <w:lang w:val="vi-VN"/>
+        </w:rPr>
+      </w:pPr>
+      <w:r>
+        <w:br/>
+      </w:r>
+      <w:r>
+        <w:rPr>
+          <w:sz w:val="28"/>
+          <w:szCs w:val="28"/>
+          <w:lang w:val="vi-VN"/>
+        </w:rPr>
+        <w:t xml:space="preserve">Hình 3.5 </w:t>
+      </w:r>
+      <w:r>
+        <w:rPr>
+          <w:sz w:val="28"/>
+          <w:szCs w:val="28"/>
+          <w:lang w:val="vi-VN"/>
+        </w:rPr>
+        <w:t>Sơ đồ Activity</w:t>
+      </w:r>
+      <w:r>
+        <w:rPr>
+          <w:sz w:val="28"/>
+          <w:szCs w:val="28"/>
+          <w:lang w:val="vi-VN"/>
+        </w:rPr>
+        <w:t xml:space="preserve"> </w:t>
+      </w:r>
+      <w:r>
+        <w:rPr>
+          <w:sz w:val="28"/>
+          <w:szCs w:val="28"/>
+          <w:lang w:val="vi-VN"/>
+        </w:rPr>
+        <w:t>– Hủy đăng ký + Auto Promotion</w:t>
+      </w:r>
     </w:p>
     <w:p>
       <w:pPr>
         <w:pStyle w:val="Heading1"/>
+        <w:jc w:val="center"/>
         <w:rPr>
           <w:b w:val="0"/>
           <w:bCs w:val="0"/>
-        </w:rPr>
-      </w:pPr>
-      <w:r>
-        <w:rPr>
-          <w:b w:val="0"/>
-          <w:bCs w:val="0"/>
-        </w:rPr>
-        <w:br/>
-      </w:r>
-    </w:p>
-    <w:p>
-      <w:pPr>
-        <w:spacing w:after="200" w:line="276" w:lineRule="auto"/>
-        <w:rPr>
-          <w:sz w:val="28"/>
-          <w:szCs w:val="28"/>
+          <w:lang w:val="vi-VN"/>
+        </w:rPr>
+      </w:pPr>
+    </w:p>
+    <w:p>
+      <w:pPr>
+        <w:rPr>
+          <w:b/>
+          <w:bCs/>
+          <w:sz w:val="28"/>
+          <w:szCs w:val="28"/>
+          <w:lang w:val="vi-VN"/>
         </w:rPr>
       </w:pPr>
       <w:bookmarkStart w:id="1" w:name="_fw8hkoac87ia" w:colFirst="0" w:colLast="0"/>
@@ -19376,6 +19811,792 @@
       <w:r>
         <w:br w:type="page"/>
       </w:r>
+      <w:r>
+        <w:rPr>
+          <w:b/>
+          <w:bCs/>
+          <w:sz w:val="28"/>
+          <w:szCs w:val="28"/>
+        </w:rPr>
+        <w:lastRenderedPageBreak/>
+        <w:t>Sơ</w:t>
+      </w:r>
+      <w:r>
+        <w:rPr>
+          <w:b/>
+          <w:bCs/>
+          <w:sz w:val="28"/>
+          <w:szCs w:val="28"/>
+          <w:lang w:val="vi-VN"/>
+        </w:rPr>
+        <w:t xml:space="preserve"> đồ </w:t>
+      </w:r>
+      <w:r>
+        <w:rPr>
+          <w:b/>
+          <w:bCs/>
+          <w:sz w:val="28"/>
+          <w:szCs w:val="28"/>
+          <w:lang w:val="vi-VN"/>
+        </w:rPr>
+        <w:t>Activity</w:t>
+      </w:r>
+      <w:r>
+        <w:rPr>
+          <w:b/>
+          <w:bCs/>
+          <w:sz w:val="28"/>
+          <w:szCs w:val="28"/>
+          <w:lang w:val="vi-VN"/>
+        </w:rPr>
+        <w:t xml:space="preserve"> </w:t>
+      </w:r>
+      <w:r>
+        <w:rPr>
+          <w:b/>
+          <w:bCs/>
+          <w:sz w:val="28"/>
+          <w:szCs w:val="28"/>
+          <w:lang w:val="vi-VN"/>
+        </w:rPr>
+        <w:t>–</w:t>
+      </w:r>
+      <w:r>
+        <w:rPr>
+          <w:b/>
+          <w:bCs/>
+          <w:sz w:val="28"/>
+          <w:szCs w:val="28"/>
+          <w:lang w:val="vi-VN"/>
+        </w:rPr>
+        <w:t xml:space="preserve"> Checkin</w:t>
+      </w:r>
+    </w:p>
+    <w:p>
+      <w:pPr>
+        <w:rPr>
+          <w:b/>
+          <w:bCs/>
+          <w:sz w:val="28"/>
+          <w:szCs w:val="28"/>
+          <w:lang w:val="vi-VN"/>
+        </w:rPr>
+      </w:pPr>
+    </w:p>
+    <w:p>
+      <w:pPr>
+        <w:rPr>
+          <w:b/>
+          <w:bCs/>
+          <w:sz w:val="28"/>
+          <w:szCs w:val="28"/>
+          <w:lang w:val="vi-VN"/>
+        </w:rPr>
+      </w:pPr>
+    </w:p>
+    <w:p>
+      <w:pPr>
+        <w:rPr>
+          <w:b/>
+          <w:bCs/>
+          <w:sz w:val="28"/>
+          <w:szCs w:val="28"/>
+          <w:lang w:val="vi-VN"/>
+        </w:rPr>
+      </w:pPr>
+    </w:p>
+    <w:p>
+      <w:pPr>
+        <w:jc w:val="center"/>
+        <w:rPr>
+          <w:b/>
+          <w:bCs/>
+          <w:sz w:val="28"/>
+          <w:szCs w:val="28"/>
+          <w:lang w:val="vi-VN"/>
+        </w:rPr>
+      </w:pPr>
+      <w:r>
+        <w:rPr>
+          <w:b/>
+          <w:bCs/>
+          <w:noProof/>
+          <w:sz w:val="28"/>
+          <w:szCs w:val="28"/>
+        </w:rPr>
+        <w:drawing>
+          <wp:inline distT="0" distB="0" distL="0" distR="0" wp14:anchorId="016D1F9F" wp14:editId="6B1AAFCD">
+            <wp:extent cx="5791835" cy="970280"/>
+            <wp:effectExtent l="0" t="0" r="0" b="1270"/>
+            <wp:docPr id="1466108789" name="Picture 4"/>
+            <wp:cNvGraphicFramePr>
+              <a:graphicFrameLocks xmlns:a="http://schemas.openxmlformats.org/drawingml/2006/main" noChangeAspect="1"/>
+            </wp:cNvGraphicFramePr>
+            <a:graphic xmlns:a="http://schemas.openxmlformats.org/drawingml/2006/main">
+              <a:graphicData uri="http://schemas.openxmlformats.org/drawingml/2006/picture">
+                <pic:pic xmlns:pic="http://schemas.openxmlformats.org/drawingml/2006/picture">
+                  <pic:nvPicPr>
+                    <pic:cNvPr id="1466108789" name="Picture 1466108789"/>
+                    <pic:cNvPicPr/>
+                  </pic:nvPicPr>
+                  <pic:blipFill>
+                    <a:blip r:embed="rId16" cstate="print">
+                      <a:extLst>
+                        <a:ext uri="{28A0092B-C50C-407E-A947-70E740481C1C}">
+                          <a14:useLocalDpi xmlns:a14="http://schemas.microsoft.com/office/drawing/2010/main" val="0"/>
+                        </a:ext>
+                      </a:extLst>
+                    </a:blip>
+                    <a:stretch>
+                      <a:fillRect/>
+                    </a:stretch>
+                  </pic:blipFill>
+                  <pic:spPr>
+                    <a:xfrm>
+                      <a:off x="0" y="0"/>
+                      <a:ext cx="5791835" cy="970280"/>
+                    </a:xfrm>
+                    <a:prstGeom prst="rect">
+                      <a:avLst/>
+                    </a:prstGeom>
+                  </pic:spPr>
+                </pic:pic>
+              </a:graphicData>
+            </a:graphic>
+          </wp:inline>
+        </w:drawing>
+      </w:r>
+    </w:p>
+    <w:p>
+      <w:pPr>
+        <w:jc w:val="center"/>
+        <w:rPr>
+          <w:sz w:val="28"/>
+          <w:szCs w:val="28"/>
+          <w:lang w:val="vi-VN"/>
+        </w:rPr>
+      </w:pPr>
+    </w:p>
+    <w:p>
+      <w:pPr>
+        <w:jc w:val="center"/>
+        <w:rPr>
+          <w:sz w:val="28"/>
+          <w:szCs w:val="28"/>
+          <w:lang w:val="vi-VN"/>
+        </w:rPr>
+      </w:pPr>
+      <w:r>
+        <w:rPr>
+          <w:sz w:val="28"/>
+          <w:szCs w:val="28"/>
+          <w:lang w:val="vi-VN"/>
+        </w:rPr>
+        <w:t xml:space="preserve">Hình 3.6 </w:t>
+      </w:r>
+      <w:r>
+        <w:rPr>
+          <w:sz w:val="28"/>
+          <w:szCs w:val="28"/>
+        </w:rPr>
+        <w:t>Sơ</w:t>
+      </w:r>
+      <w:r>
+        <w:rPr>
+          <w:sz w:val="28"/>
+          <w:szCs w:val="28"/>
+          <w:lang w:val="vi-VN"/>
+        </w:rPr>
+        <w:t xml:space="preserve"> đồ Activity – Checkin</w:t>
+      </w:r>
+      <w:r>
+        <w:rPr>
+          <w:sz w:val="28"/>
+          <w:szCs w:val="28"/>
+        </w:rPr>
+        <w:t xml:space="preserve"> </w:t>
+      </w:r>
+    </w:p>
+    <w:p>
+      <w:pPr>
+        <w:jc w:val="center"/>
+        <w:rPr>
+          <w:sz w:val="28"/>
+          <w:szCs w:val="28"/>
+          <w:lang w:val="vi-VN"/>
+        </w:rPr>
+      </w:pPr>
+    </w:p>
+    <w:p>
+      <w:pPr>
+        <w:rPr>
+          <w:b/>
+          <w:bCs/>
+          <w:sz w:val="28"/>
+          <w:szCs w:val="28"/>
+          <w:lang w:val="vi-VN"/>
+        </w:rPr>
+      </w:pPr>
+      <w:r>
+        <w:rPr>
+          <w:b/>
+          <w:bCs/>
+          <w:sz w:val="28"/>
+          <w:szCs w:val="28"/>
+          <w:lang w:val="vi-VN"/>
+        </w:rPr>
+        <w:t xml:space="preserve">Sơ đồ </w:t>
+      </w:r>
+      <w:r>
+        <w:rPr>
+          <w:b/>
+          <w:bCs/>
+          <w:sz w:val="28"/>
+          <w:szCs w:val="28"/>
+          <w:lang w:val="vi-VN"/>
+        </w:rPr>
+        <w:t>Activity – Survey</w:t>
+      </w:r>
+      <w:r>
+        <w:rPr>
+          <w:b/>
+          <w:bCs/>
+          <w:sz w:val="28"/>
+          <w:szCs w:val="28"/>
+          <w:lang w:val="vi-VN"/>
+        </w:rPr>
+        <w:t xml:space="preserve"> </w:t>
+      </w:r>
+    </w:p>
+    <w:p>
+      <w:pPr>
+        <w:rPr>
+          <w:b/>
+          <w:bCs/>
+          <w:sz w:val="28"/>
+          <w:szCs w:val="28"/>
+          <w:lang w:val="vi-VN"/>
+        </w:rPr>
+      </w:pPr>
+    </w:p>
+    <w:p>
+      <w:pPr>
+        <w:rPr>
+          <w:b/>
+          <w:bCs/>
+          <w:sz w:val="28"/>
+          <w:szCs w:val="28"/>
+          <w:lang w:val="vi-VN"/>
+        </w:rPr>
+      </w:pPr>
+    </w:p>
+    <w:p>
+      <w:pPr>
+        <w:rPr>
+          <w:b/>
+          <w:bCs/>
+          <w:sz w:val="28"/>
+          <w:szCs w:val="28"/>
+          <w:lang w:val="vi-VN"/>
+        </w:rPr>
+      </w:pPr>
+    </w:p>
+    <w:p>
+      <w:pPr>
+        <w:rPr>
+          <w:sz w:val="28"/>
+          <w:szCs w:val="28"/>
+          <w:lang w:val="vi-VN"/>
+        </w:rPr>
+      </w:pPr>
+      <w:r>
+        <w:rPr>
+          <w:noProof/>
+          <w:sz w:val="28"/>
+          <w:szCs w:val="28"/>
+        </w:rPr>
+        <w:drawing>
+          <wp:inline distT="0" distB="0" distL="0" distR="0" wp14:anchorId="45BE4AB7" wp14:editId="5948D06F">
+            <wp:extent cx="5791835" cy="1775460"/>
+            <wp:effectExtent l="0" t="0" r="0" b="0"/>
+            <wp:docPr id="592838090" name="Picture 5"/>
+            <wp:cNvGraphicFramePr>
+              <a:graphicFrameLocks xmlns:a="http://schemas.openxmlformats.org/drawingml/2006/main" noChangeAspect="1"/>
+            </wp:cNvGraphicFramePr>
+            <a:graphic xmlns:a="http://schemas.openxmlformats.org/drawingml/2006/main">
+              <a:graphicData uri="http://schemas.openxmlformats.org/drawingml/2006/picture">
+                <pic:pic xmlns:pic="http://schemas.openxmlformats.org/drawingml/2006/picture">
+                  <pic:nvPicPr>
+                    <pic:cNvPr id="592838090" name="Picture 592838090"/>
+                    <pic:cNvPicPr/>
+                  </pic:nvPicPr>
+                  <pic:blipFill>
+                    <a:blip r:embed="rId17" cstate="print">
+                      <a:extLst>
+                        <a:ext uri="{28A0092B-C50C-407E-A947-70E740481C1C}">
+                          <a14:useLocalDpi xmlns:a14="http://schemas.microsoft.com/office/drawing/2010/main" val="0"/>
+                        </a:ext>
+                      </a:extLst>
+                    </a:blip>
+                    <a:stretch>
+                      <a:fillRect/>
+                    </a:stretch>
+                  </pic:blipFill>
+                  <pic:spPr>
+                    <a:xfrm>
+                      <a:off x="0" y="0"/>
+                      <a:ext cx="5791835" cy="1775460"/>
+                    </a:xfrm>
+                    <a:prstGeom prst="rect">
+                      <a:avLst/>
+                    </a:prstGeom>
+                  </pic:spPr>
+                </pic:pic>
+              </a:graphicData>
+            </a:graphic>
+          </wp:inline>
+        </w:drawing>
+      </w:r>
+    </w:p>
+    <w:p>
+      <w:pPr>
+        <w:jc w:val="center"/>
+        <w:rPr>
+          <w:sz w:val="28"/>
+          <w:szCs w:val="28"/>
+          <w:lang w:val="vi-VN"/>
+        </w:rPr>
+      </w:pPr>
+    </w:p>
+    <w:p>
+      <w:pPr>
+        <w:jc w:val="center"/>
+        <w:rPr>
+          <w:sz w:val="28"/>
+          <w:szCs w:val="28"/>
+          <w:lang w:val="vi-VN"/>
+        </w:rPr>
+      </w:pPr>
+      <w:r>
+        <w:rPr>
+          <w:sz w:val="28"/>
+          <w:szCs w:val="28"/>
+          <w:lang w:val="vi-VN"/>
+        </w:rPr>
+        <w:t xml:space="preserve">Hình 3.7 Sơ đồ </w:t>
+      </w:r>
+      <w:r>
+        <w:rPr>
+          <w:sz w:val="28"/>
+          <w:szCs w:val="28"/>
+          <w:lang w:val="vi-VN"/>
+        </w:rPr>
+        <w:t>Activity – Survey</w:t>
+      </w:r>
+      <w:r>
+        <w:rPr>
+          <w:sz w:val="28"/>
+          <w:szCs w:val="28"/>
+          <w:lang w:val="vi-VN"/>
+        </w:rPr>
+        <w:t xml:space="preserve"> </w:t>
+      </w:r>
+      <w:r>
+        <w:rPr>
+          <w:sz w:val="28"/>
+          <w:szCs w:val="28"/>
+          <w:lang w:val="vi-VN"/>
+        </w:rPr>
+        <w:br/>
+      </w:r>
+    </w:p>
+    <w:p>
+      <w:pPr>
+        <w:rPr>
+          <w:b/>
+          <w:bCs/>
+          <w:sz w:val="28"/>
+          <w:szCs w:val="28"/>
+          <w:lang w:val="vi-VN"/>
+        </w:rPr>
+      </w:pPr>
+      <w:r>
+        <w:rPr>
+          <w:sz w:val="28"/>
+          <w:szCs w:val="28"/>
+          <w:lang w:val="vi-VN"/>
+        </w:rPr>
+        <w:br w:type="page"/>
+      </w:r>
+      <w:r>
+        <w:rPr>
+          <w:b/>
+          <w:bCs/>
+          <w:sz w:val="28"/>
+          <w:szCs w:val="28"/>
+          <w:lang w:val="vi-VN"/>
+        </w:rPr>
+        <w:lastRenderedPageBreak/>
+        <w:t xml:space="preserve">Sơ đồ </w:t>
+      </w:r>
+      <w:r>
+        <w:rPr>
+          <w:b/>
+          <w:bCs/>
+          <w:sz w:val="28"/>
+          <w:szCs w:val="28"/>
+          <w:lang w:val="vi-VN"/>
+        </w:rPr>
+        <w:t>Activity  – Waitlist</w:t>
+      </w:r>
+      <w:r>
+        <w:rPr>
+          <w:b/>
+          <w:bCs/>
+          <w:sz w:val="28"/>
+          <w:szCs w:val="28"/>
+          <w:lang w:val="vi-VN"/>
+        </w:rPr>
+        <w:t xml:space="preserve"> </w:t>
+      </w:r>
+    </w:p>
+    <w:p>
+      <w:pPr>
+        <w:rPr>
+          <w:b/>
+          <w:bCs/>
+          <w:sz w:val="28"/>
+          <w:szCs w:val="28"/>
+          <w:lang w:val="vi-VN"/>
+        </w:rPr>
+      </w:pPr>
+    </w:p>
+    <w:p>
+      <w:pPr>
+        <w:rPr>
+          <w:b/>
+          <w:bCs/>
+          <w:sz w:val="28"/>
+          <w:szCs w:val="28"/>
+          <w:lang w:val="vi-VN"/>
+        </w:rPr>
+      </w:pPr>
+    </w:p>
+    <w:p>
+      <w:pPr>
+        <w:rPr>
+          <w:sz w:val="28"/>
+          <w:szCs w:val="28"/>
+          <w:lang w:val="vi-VN"/>
+        </w:rPr>
+      </w:pPr>
+      <w:r>
+        <w:rPr>
+          <w:noProof/>
+          <w:sz w:val="28"/>
+          <w:szCs w:val="28"/>
+        </w:rPr>
+        <w:drawing>
+          <wp:inline distT="0" distB="0" distL="0" distR="0" wp14:anchorId="7A786C63" wp14:editId="633DEA0D">
+            <wp:extent cx="5791835" cy="2948940"/>
+            <wp:effectExtent l="0" t="0" r="0" b="3810"/>
+            <wp:docPr id="970685643" name="Picture 6"/>
+            <wp:cNvGraphicFramePr>
+              <a:graphicFrameLocks xmlns:a="http://schemas.openxmlformats.org/drawingml/2006/main" noChangeAspect="1"/>
+            </wp:cNvGraphicFramePr>
+            <a:graphic xmlns:a="http://schemas.openxmlformats.org/drawingml/2006/main">
+              <a:graphicData uri="http://schemas.openxmlformats.org/drawingml/2006/picture">
+                <pic:pic xmlns:pic="http://schemas.openxmlformats.org/drawingml/2006/picture">
+                  <pic:nvPicPr>
+                    <pic:cNvPr id="970685643" name="Picture 970685643"/>
+                    <pic:cNvPicPr/>
+                  </pic:nvPicPr>
+                  <pic:blipFill>
+                    <a:blip r:embed="rId18" cstate="print">
+                      <a:extLst>
+                        <a:ext uri="{28A0092B-C50C-407E-A947-70E740481C1C}">
+                          <a14:useLocalDpi xmlns:a14="http://schemas.microsoft.com/office/drawing/2010/main" val="0"/>
+                        </a:ext>
+                      </a:extLst>
+                    </a:blip>
+                    <a:stretch>
+                      <a:fillRect/>
+                    </a:stretch>
+                  </pic:blipFill>
+                  <pic:spPr>
+                    <a:xfrm>
+                      <a:off x="0" y="0"/>
+                      <a:ext cx="5791835" cy="2948940"/>
+                    </a:xfrm>
+                    <a:prstGeom prst="rect">
+                      <a:avLst/>
+                    </a:prstGeom>
+                  </pic:spPr>
+                </pic:pic>
+              </a:graphicData>
+            </a:graphic>
+          </wp:inline>
+        </w:drawing>
+      </w:r>
+    </w:p>
+    <w:p>
+      <w:pPr>
+        <w:rPr>
+          <w:sz w:val="28"/>
+          <w:szCs w:val="28"/>
+          <w:lang w:val="vi-VN"/>
+        </w:rPr>
+      </w:pPr>
+    </w:p>
+    <w:p>
+      <w:pPr>
+        <w:jc w:val="center"/>
+        <w:rPr>
+          <w:sz w:val="28"/>
+          <w:szCs w:val="28"/>
+          <w:lang w:val="vi-VN"/>
+        </w:rPr>
+      </w:pPr>
+    </w:p>
+    <w:p>
+      <w:pPr>
+        <w:jc w:val="center"/>
+        <w:rPr>
+          <w:sz w:val="28"/>
+          <w:szCs w:val="28"/>
+          <w:lang w:val="vi-VN"/>
+        </w:rPr>
+      </w:pPr>
+      <w:r>
+        <w:rPr>
+          <w:sz w:val="28"/>
+          <w:szCs w:val="28"/>
+          <w:lang w:val="vi-VN"/>
+        </w:rPr>
+        <w:t xml:space="preserve">Hình 3.8 Sơ đồ </w:t>
+      </w:r>
+      <w:r>
+        <w:rPr>
+          <w:sz w:val="28"/>
+          <w:szCs w:val="28"/>
+          <w:lang w:val="vi-VN"/>
+        </w:rPr>
+        <w:t>Activity  – Waitlist</w:t>
+      </w:r>
+      <w:r>
+        <w:rPr>
+          <w:sz w:val="28"/>
+          <w:szCs w:val="28"/>
+          <w:lang w:val="vi-VN"/>
+        </w:rPr>
+        <w:t xml:space="preserve"> </w:t>
+      </w:r>
+    </w:p>
+    <w:p>
+      <w:pPr>
+        <w:rPr>
+          <w:sz w:val="28"/>
+          <w:szCs w:val="28"/>
+          <w:lang w:val="vi-VN"/>
+        </w:rPr>
+      </w:pPr>
+      <w:r>
+        <w:rPr>
+          <w:sz w:val="28"/>
+          <w:szCs w:val="28"/>
+          <w:lang w:val="vi-VN"/>
+        </w:rPr>
+        <w:br w:type="page"/>
+      </w:r>
+    </w:p>
+    <w:p>
+      <w:pPr>
+        <w:rPr>
+          <w:b/>
+          <w:bCs/>
+          <w:sz w:val="28"/>
+          <w:szCs w:val="28"/>
+          <w:lang w:val="vi-VN"/>
+        </w:rPr>
+      </w:pPr>
+      <w:r>
+        <w:rPr>
+          <w:b/>
+          <w:bCs/>
+          <w:sz w:val="28"/>
+          <w:szCs w:val="28"/>
+          <w:lang w:val="vi-VN"/>
+        </w:rPr>
+        <w:lastRenderedPageBreak/>
+        <w:t>3.6 ERD</w:t>
+      </w:r>
+    </w:p>
+    <w:p>
+      <w:pPr>
+        <w:rPr>
+          <w:b/>
+          <w:bCs/>
+          <w:sz w:val="28"/>
+          <w:szCs w:val="28"/>
+          <w:lang w:val="vi-VN"/>
+        </w:rPr>
+      </w:pPr>
+    </w:p>
+    <w:p>
+      <w:pPr>
+        <w:rPr>
+          <w:b/>
+          <w:bCs/>
+          <w:sz w:val="28"/>
+          <w:szCs w:val="28"/>
+          <w:lang w:val="vi-VN"/>
+        </w:rPr>
+      </w:pPr>
+    </w:p>
+    <w:p>
+      <w:pPr>
+        <w:rPr>
+          <w:b/>
+          <w:bCs/>
+          <w:sz w:val="28"/>
+          <w:szCs w:val="28"/>
+          <w:lang w:val="vi-VN"/>
+        </w:rPr>
+      </w:pPr>
+      <w:r>
+        <w:rPr>
+          <w:b/>
+          <w:bCs/>
+          <w:noProof/>
+          <w:sz w:val="28"/>
+          <w:szCs w:val="28"/>
+          <w:lang w:val="vi-VN"/>
+        </w:rPr>
+        <w:drawing>
+          <wp:inline distT="0" distB="0" distL="0" distR="0" wp14:anchorId="1688E287" wp14:editId="1B5D3EC6">
+            <wp:extent cx="5837555" cy="4114800"/>
+            <wp:effectExtent l="0" t="0" r="0" b="0"/>
+            <wp:docPr id="698339159" name="Picture 7"/>
+            <wp:cNvGraphicFramePr>
+              <a:graphicFrameLocks xmlns:a="http://schemas.openxmlformats.org/drawingml/2006/main" noChangeAspect="1"/>
+            </wp:cNvGraphicFramePr>
+            <a:graphic xmlns:a="http://schemas.openxmlformats.org/drawingml/2006/main">
+              <a:graphicData uri="http://schemas.openxmlformats.org/drawingml/2006/picture">
+                <pic:pic xmlns:pic="http://schemas.openxmlformats.org/drawingml/2006/picture">
+                  <pic:nvPicPr>
+                    <pic:cNvPr id="698339159" name="Picture 698339159"/>
+                    <pic:cNvPicPr/>
+                  </pic:nvPicPr>
+                  <pic:blipFill>
+                    <a:blip r:embed="rId19" cstate="print">
+                      <a:extLst>
+                        <a:ext uri="{28A0092B-C50C-407E-A947-70E740481C1C}">
+                          <a14:useLocalDpi xmlns:a14="http://schemas.microsoft.com/office/drawing/2010/main" val="0"/>
+                        </a:ext>
+                      </a:extLst>
+                    </a:blip>
+                    <a:stretch>
+                      <a:fillRect/>
+                    </a:stretch>
+                  </pic:blipFill>
+                  <pic:spPr>
+                    <a:xfrm>
+                      <a:off x="0" y="0"/>
+                      <a:ext cx="5837555" cy="4114800"/>
+                    </a:xfrm>
+                    <a:prstGeom prst="rect">
+                      <a:avLst/>
+                    </a:prstGeom>
+                  </pic:spPr>
+                </pic:pic>
+              </a:graphicData>
+            </a:graphic>
+          </wp:inline>
+        </w:drawing>
+      </w:r>
+    </w:p>
+    <w:p>
+      <w:pPr>
+        <w:rPr>
+          <w:b/>
+          <w:bCs/>
+          <w:sz w:val="28"/>
+          <w:szCs w:val="28"/>
+          <w:lang w:val="vi-VN"/>
+        </w:rPr>
+      </w:pPr>
+    </w:p>
+    <w:p>
+      <w:pPr>
+        <w:jc w:val="center"/>
+        <w:rPr>
+          <w:sz w:val="28"/>
+          <w:szCs w:val="28"/>
+          <w:lang w:val="vi-VN"/>
+        </w:rPr>
+      </w:pPr>
+    </w:p>
+    <w:p>
+      <w:pPr>
+        <w:jc w:val="center"/>
+        <w:rPr>
+          <w:sz w:val="28"/>
+          <w:szCs w:val="28"/>
+          <w:lang w:val="vi-VN"/>
+        </w:rPr>
+      </w:pPr>
+      <w:r>
+        <w:rPr>
+          <w:sz w:val="28"/>
+          <w:szCs w:val="28"/>
+          <w:lang w:val="vi-VN"/>
+        </w:rPr>
+        <w:t>Hình 3.9 Sơ đồ ERD</w:t>
+      </w:r>
+    </w:p>
+    <w:p>
+      <w:pPr>
+        <w:rPr>
+          <w:sz w:val="28"/>
+          <w:szCs w:val="28"/>
+          <w:lang w:val="vi-VN"/>
+        </w:rPr>
+      </w:pPr>
+      <w:r>
+        <w:rPr>
+          <w:sz w:val="28"/>
+          <w:szCs w:val="28"/>
+        </w:rPr>
+        <w:br w:type="page"/>
+      </w:r>
+    </w:p>
+    <w:p>
+      <w:pPr>
+        <w:rPr>
+          <w:sz w:val="28"/>
+          <w:szCs w:val="28"/>
+          <w:lang w:val="vi-VN"/>
+        </w:rPr>
+      </w:pPr>
+    </w:p>
+    <w:p>
+      <w:pPr>
+        <w:jc w:val="center"/>
+        <w:rPr>
+          <w:sz w:val="28"/>
+          <w:szCs w:val="28"/>
+          <w:lang w:val="vi-VN"/>
+        </w:rPr>
+      </w:pPr>
+    </w:p>
+    <w:p>
+      <w:pPr>
+        <w:spacing w:after="200" w:line="276" w:lineRule="auto"/>
+        <w:rPr>
+          <w:sz w:val="28"/>
+          <w:szCs w:val="28"/>
+        </w:rPr>
+      </w:pPr>
     </w:p>
     <w:p>
       <w:pPr>
@@ -19391,7 +20612,6 @@
           <w:b w:val="0"/>
           <w:bCs w:val="0"/>
         </w:rPr>
-        <w:lastRenderedPageBreak/>
         <w:t>5. KẾT QUẢ, KẾT LUẬN/ HƯỚNG PHÁT TRIỂN</w:t>
       </w:r>
       <w:r>
@@ -19445,6 +20665,7 @@
           <w:b w:val="0"/>
           <w:bCs w:val="0"/>
         </w:rPr>
+        <w:lastRenderedPageBreak/>
         <w:t xml:space="preserve">TÀI LIỆU THAM KHẢO </w:t>
       </w:r>
     </w:p>
@@ -19502,9 +20723,9 @@
       </w:r>
     </w:p>
     <w:sectPr>
-      <w:headerReference w:type="default" r:id="rId13"/>
-      <w:footerReference w:type="default" r:id="rId14"/>
-      <w:headerReference w:type="first" r:id="rId15"/>
+      <w:headerReference w:type="default" r:id="rId20"/>
+      <w:footerReference w:type="default" r:id="rId21"/>
+      <w:headerReference w:type="first" r:id="rId22"/>
       <w:pgSz w:w="12240" w:h="15840"/>
       <w:pgMar w:top="1350" w:right="1134" w:bottom="1134" w:left="1985" w:header="432" w:footer="576" w:gutter="0"/>
       <w:pgNumType w:start="1"/>
@@ -19516,7 +20737,7 @@
 </file>
 
 <file path=word/endnotes.xml><?xml version="1.0" encoding="utf-8"?>
-<w:endnotes xmlns:wpc="http://schemas.microsoft.com/office/word/2010/wordprocessingCanvas" xmlns:cx="http://schemas.microsoft.com/office/drawing/2014/chartex" xmlns:cx1="http://schemas.microsoft.com/office/drawing/2015/9/8/chartex" xmlns:cx2="http://schemas.microsoft.com/office/drawing/2015/10/21/chartex" xmlns:cx3="http://schemas.microsoft.com/office/drawing/2016/5/9/chartex" xmlns:cx4="http://schemas.microsoft.com/office/drawing/2016/5/10/chartex" xmlns:cx5="http://schemas.microsoft.com/office/drawing/2016/5/11/chartex" xmlns:cx6="http://schemas.microsoft.com/office/drawing/2016/5/12/chartex" xmlns:cx7="http://schemas.microsoft.com/office/drawing/2016/5/13/chartex" xmlns:cx8="http://schemas.microsoft.com/office/drawing/2016/5/14/chartex" xmlns:mc="http://schemas.openxmlformats.org/markup-compatibility/2006" xmlns:aink="http://schemas.microsoft.com/office/drawing/2016/ink" xmlns:am3d="http://schemas.microsoft.com/office/drawing/2017/model3d" xmlns:o="urn:schemas-microsoft-com:office:office" xmlns:oel="http://schemas.microsoft.com/office/2019/extlst" xmlns:r="http://schemas.openxmlformats.org/officeDocument/2006/relationships" xmlns:m="http://schemas.openxmlformats.org/officeDocument/2006/math" xmlns:v="urn:schemas-microsoft-com:vml" xmlns:wp14="http://schemas.microsoft.com/office/word/2010/wordprocessingDrawing" xmlns:wp="http://schemas.openxmlformats.org/drawingml/2006/wordprocessingDrawing" xmlns:w10="urn:schemas-microsoft-com:office:word" xmlns:w="http://schemas.openxmlformats.org/wordprocessingml/2006/main" xmlns:w14="http://schemas.microsoft.com/office/word/2010/wordml" xmlns:w15="http://schemas.microsoft.com/office/word/2012/wordml" xmlns:w16cei="http://schemas.microsoft.com/office/word/2026/wordml/cei" xmlns:w16cex="http://schemas.microsoft.com/office/word/2018/wordml/cex" xmlns:w16cid="http://schemas.microsoft.com/office/word/2016/wordml/cid" xmlns:w16="http://schemas.microsoft.com/office/word/2018/wordml" xmlns:w16du="http://schemas.microsoft.com/office/word/2023/wordml/word16du" xmlns:w16sdtdh="http://schemas.microsoft.com/office/word/2020/wordml/sdtdatahash" xmlns:w16sdtfl="http://schemas.microsoft.com/office/word/2024/wordml/sdtformatlock" xmlns:w16se="http://schemas.microsoft.com/office/word/2015/wordml/symex" xmlns:wpg="http://schemas.microsoft.com/office/word/2010/wordprocessingGroup" xmlns:wpi="http://schemas.microsoft.com/office/word/2010/wordprocessingInk" xmlns:wne="http://schemas.microsoft.com/office/word/2006/wordml" xmlns:wps="http://schemas.microsoft.com/office/word/2010/wordprocessingShape" mc:Ignorable="w14 w15 w16se w16cid w16 w16cex w16sdtdh w16sdtfl w16du wp14">
+<w:endnotes xmlns:wpc="http://schemas.microsoft.com/office/word/2010/wordprocessingCanvas" xmlns:cx="http://schemas.microsoft.com/office/drawing/2014/chartex" xmlns:cx1="http://schemas.microsoft.com/office/drawing/2015/9/8/chartex" xmlns:cx2="http://schemas.microsoft.com/office/drawing/2015/10/21/chartex" xmlns:cx3="http://schemas.microsoft.com/office/drawing/2016/5/9/chartex" xmlns:cx4="http://schemas.microsoft.com/office/drawing/2016/5/10/chartex" xmlns:cx5="http://schemas.microsoft.com/office/drawing/2016/5/11/chartex" xmlns:cx6="http://schemas.microsoft.com/office/drawing/2016/5/12/chartex" xmlns:cx7="http://schemas.microsoft.com/office/drawing/2016/5/13/chartex" xmlns:cx8="http://schemas.microsoft.com/office/drawing/2016/5/14/chartex" xmlns:mc="http://schemas.openxmlformats.org/markup-compatibility/2006" xmlns:aink="http://schemas.microsoft.com/office/drawing/2016/ink" xmlns:am3d="http://schemas.microsoft.com/office/drawing/2017/model3d" xmlns:o="urn:schemas-microsoft-com:office:office" xmlns:oel="http://schemas.microsoft.com/office/2019/extlst" xmlns:r="http://schemas.openxmlformats.org/officeDocument/2006/relationships" xmlns:m="http://schemas.openxmlformats.org/officeDocument/2006/math" xmlns:v="urn:schemas-microsoft-com:vml" xmlns:wp14="http://schemas.microsoft.com/office/word/2010/wordprocessingDrawing" xmlns:wp="http://schemas.openxmlformats.org/drawingml/2006/wordprocessingDrawing" xmlns:w10="urn:schemas-microsoft-com:office:word" xmlns:w="http://schemas.openxmlformats.org/wordprocessingml/2006/main" xmlns:w14="http://schemas.microsoft.com/office/word/2010/wordml" xmlns:w15="http://schemas.microsoft.com/office/word/2012/wordml" xmlns:w16cex="http://schemas.microsoft.com/office/word/2018/wordml/cex" xmlns:w16cid="http://schemas.microsoft.com/office/word/2016/wordml/cid" xmlns:w16="http://schemas.microsoft.com/office/word/2018/wordml" xmlns:w16du="http://schemas.microsoft.com/office/word/2023/wordml/word16du" xmlns:w16sdtdh="http://schemas.microsoft.com/office/word/2020/wordml/sdtdatahash" xmlns:w16sdtfl="http://schemas.microsoft.com/office/word/2024/wordml/sdtformatlock" xmlns:w16se="http://schemas.microsoft.com/office/word/2015/wordml/symex" xmlns:wpg="http://schemas.microsoft.com/office/word/2010/wordprocessingGroup" xmlns:wpi="http://schemas.microsoft.com/office/word/2010/wordprocessingInk" xmlns:wne="http://schemas.microsoft.com/office/word/2006/wordml" xmlns:wps="http://schemas.microsoft.com/office/word/2010/wordprocessingShape" mc:Ignorable="w14 w15 w16se w16cid w16 w16cex w16sdtdh w16sdtfl w16du wp14">
   <w:endnote w:type="separator" w:id="-1">
     <w:p>
       <w:r>
@@ -19535,7 +20756,7 @@
 </file>
 
 <file path=word/footer1.xml><?xml version="1.0" encoding="utf-8"?>
-<w:ftr xmlns:wpc="http://schemas.microsoft.com/office/word/2010/wordprocessingCanvas" xmlns:cx="http://schemas.microsoft.com/office/drawing/2014/chartex" xmlns:cx1="http://schemas.microsoft.com/office/drawing/2015/9/8/chartex" xmlns:cx2="http://schemas.microsoft.com/office/drawing/2015/10/21/chartex" xmlns:cx3="http://schemas.microsoft.com/office/drawing/2016/5/9/chartex" xmlns:cx4="http://schemas.microsoft.com/office/drawing/2016/5/10/chartex" xmlns:cx5="http://schemas.microsoft.com/office/drawing/2016/5/11/chartex" xmlns:cx6="http://schemas.microsoft.com/office/drawing/2016/5/12/chartex" xmlns:cx7="http://schemas.microsoft.com/office/drawing/2016/5/13/chartex" xmlns:cx8="http://schemas.microsoft.com/office/drawing/2016/5/14/chartex" xmlns:mc="http://schemas.openxmlformats.org/markup-compatibility/2006" xmlns:aink="http://schemas.microsoft.com/office/drawing/2016/ink" xmlns:am3d="http://schemas.microsoft.com/office/drawing/2017/model3d" xmlns:o="urn:schemas-microsoft-com:office:office" xmlns:oel="http://schemas.microsoft.com/office/2019/extlst" xmlns:r="http://schemas.openxmlformats.org/officeDocument/2006/relationships" xmlns:m="http://schemas.openxmlformats.org/officeDocument/2006/math" xmlns:v="urn:schemas-microsoft-com:vml" xmlns:wp14="http://schemas.microsoft.com/office/word/2010/wordprocessingDrawing" xmlns:wp="http://schemas.openxmlformats.org/drawingml/2006/wordprocessingDrawing" xmlns:w10="urn:schemas-microsoft-com:office:word" xmlns:w="http://schemas.openxmlformats.org/wordprocessingml/2006/main" xmlns:w14="http://schemas.microsoft.com/office/word/2010/wordml" xmlns:w15="http://schemas.microsoft.com/office/word/2012/wordml" xmlns:w16cei="http://schemas.microsoft.com/office/word/2026/wordml/cei" xmlns:w16cex="http://schemas.microsoft.com/office/word/2018/wordml/cex" xmlns:w16cid="http://schemas.microsoft.com/office/word/2016/wordml/cid" xmlns:w16="http://schemas.microsoft.com/office/word/2018/wordml" xmlns:w16du="http://schemas.microsoft.com/office/word/2023/wordml/word16du" xmlns:w16sdtdh="http://schemas.microsoft.com/office/word/2020/wordml/sdtdatahash" xmlns:w16sdtfl="http://schemas.microsoft.com/office/word/2024/wordml/sdtformatlock" xmlns:w16se="http://schemas.microsoft.com/office/word/2015/wordml/symex" xmlns:wpg="http://schemas.microsoft.com/office/word/2010/wordprocessingGroup" xmlns:wpi="http://schemas.microsoft.com/office/word/2010/wordprocessingInk" xmlns:wne="http://schemas.microsoft.com/office/word/2006/wordml" xmlns:wps="http://schemas.microsoft.com/office/word/2010/wordprocessingShape" mc:Ignorable="w14 w15 w16se w16cid w16 w16cex w16sdtdh w16sdtfl w16du wp14">
+<w:ftr xmlns:wpc="http://schemas.microsoft.com/office/word/2010/wordprocessingCanvas" xmlns:cx="http://schemas.microsoft.com/office/drawing/2014/chartex" xmlns:cx1="http://schemas.microsoft.com/office/drawing/2015/9/8/chartex" xmlns:cx2="http://schemas.microsoft.com/office/drawing/2015/10/21/chartex" xmlns:cx3="http://schemas.microsoft.com/office/drawing/2016/5/9/chartex" xmlns:cx4="http://schemas.microsoft.com/office/drawing/2016/5/10/chartex" xmlns:cx5="http://schemas.microsoft.com/office/drawing/2016/5/11/chartex" xmlns:cx6="http://schemas.microsoft.com/office/drawing/2016/5/12/chartex" xmlns:cx7="http://schemas.microsoft.com/office/drawing/2016/5/13/chartex" xmlns:cx8="http://schemas.microsoft.com/office/drawing/2016/5/14/chartex" xmlns:mc="http://schemas.openxmlformats.org/markup-compatibility/2006" xmlns:aink="http://schemas.microsoft.com/office/drawing/2016/ink" xmlns:am3d="http://schemas.microsoft.com/office/drawing/2017/model3d" xmlns:o="urn:schemas-microsoft-com:office:office" xmlns:oel="http://schemas.microsoft.com/office/2019/extlst" xmlns:r="http://schemas.openxmlformats.org/officeDocument/2006/relationships" xmlns:m="http://schemas.openxmlformats.org/officeDocument/2006/math" xmlns:v="urn:schemas-microsoft-com:vml" xmlns:wp14="http://schemas.microsoft.com/office/word/2010/wordprocessingDrawing" xmlns:wp="http://schemas.openxmlformats.org/drawingml/2006/wordprocessingDrawing" xmlns:w10="urn:schemas-microsoft-com:office:word" xmlns:w="http://schemas.openxmlformats.org/wordprocessingml/2006/main" xmlns:w14="http://schemas.microsoft.com/office/word/2010/wordml" xmlns:w15="http://schemas.microsoft.com/office/word/2012/wordml" xmlns:w16cex="http://schemas.microsoft.com/office/word/2018/wordml/cex" xmlns:w16cid="http://schemas.microsoft.com/office/word/2016/wordml/cid" xmlns:w16="http://schemas.microsoft.com/office/word/2018/wordml" xmlns:w16du="http://schemas.microsoft.com/office/word/2023/wordml/word16du" xmlns:w16sdtdh="http://schemas.microsoft.com/office/word/2020/wordml/sdtdatahash" xmlns:w16sdtfl="http://schemas.microsoft.com/office/word/2024/wordml/sdtformatlock" xmlns:w16se="http://schemas.microsoft.com/office/word/2015/wordml/symex" xmlns:wpg="http://schemas.microsoft.com/office/word/2010/wordprocessingGroup" xmlns:wpi="http://schemas.microsoft.com/office/word/2010/wordprocessingInk" xmlns:wne="http://schemas.microsoft.com/office/word/2006/wordml" xmlns:wps="http://schemas.microsoft.com/office/word/2010/wordprocessingShape" mc:Ignorable="w14 w15 w16se w16cid w16 w16cex w16sdtdh w16sdtfl w16du wp14">
   <w:p>
     <w:pPr>
       <w:pBdr>
@@ -19583,7 +20804,7 @@
 </file>
 
 <file path=word/footer2.xml><?xml version="1.0" encoding="utf-8"?>
-<w:ftr xmlns:wpc="http://schemas.microsoft.com/office/word/2010/wordprocessingCanvas" xmlns:cx="http://schemas.microsoft.com/office/drawing/2014/chartex" xmlns:cx1="http://schemas.microsoft.com/office/drawing/2015/9/8/chartex" xmlns:cx2="http://schemas.microsoft.com/office/drawing/2015/10/21/chartex" xmlns:cx3="http://schemas.microsoft.com/office/drawing/2016/5/9/chartex" xmlns:cx4="http://schemas.microsoft.com/office/drawing/2016/5/10/chartex" xmlns:cx5="http://schemas.microsoft.com/office/drawing/2016/5/11/chartex" xmlns:cx6="http://schemas.microsoft.com/office/drawing/2016/5/12/chartex" xmlns:cx7="http://schemas.microsoft.com/office/drawing/2016/5/13/chartex" xmlns:cx8="http://schemas.microsoft.com/office/drawing/2016/5/14/chartex" xmlns:mc="http://schemas.openxmlformats.org/markup-compatibility/2006" xmlns:aink="http://schemas.microsoft.com/office/drawing/2016/ink" xmlns:am3d="http://schemas.microsoft.com/office/drawing/2017/model3d" xmlns:o="urn:schemas-microsoft-com:office:office" xmlns:oel="http://schemas.microsoft.com/office/2019/extlst" xmlns:r="http://schemas.openxmlformats.org/officeDocument/2006/relationships" xmlns:m="http://schemas.openxmlformats.org/officeDocument/2006/math" xmlns:v="urn:schemas-microsoft-com:vml" xmlns:wp14="http://schemas.microsoft.com/office/word/2010/wordprocessingDrawing" xmlns:wp="http://schemas.openxmlformats.org/drawingml/2006/wordprocessingDrawing" xmlns:w10="urn:schemas-microsoft-com:office:word" xmlns:w="http://schemas.openxmlformats.org/wordprocessingml/2006/main" xmlns:w14="http://schemas.microsoft.com/office/word/2010/wordml" xmlns:w15="http://schemas.microsoft.com/office/word/2012/wordml" xmlns:w16cei="http://schemas.microsoft.com/office/word/2026/wordml/cei" xmlns:w16cex="http://schemas.microsoft.com/office/word/2018/wordml/cex" xmlns:w16cid="http://schemas.microsoft.com/office/word/2016/wordml/cid" xmlns:w16="http://schemas.microsoft.com/office/word/2018/wordml" xmlns:w16du="http://schemas.microsoft.com/office/word/2023/wordml/word16du" xmlns:w16sdtdh="http://schemas.microsoft.com/office/word/2020/wordml/sdtdatahash" xmlns:w16sdtfl="http://schemas.microsoft.com/office/word/2024/wordml/sdtformatlock" xmlns:w16se="http://schemas.microsoft.com/office/word/2015/wordml/symex" xmlns:wpg="http://schemas.microsoft.com/office/word/2010/wordprocessingGroup" xmlns:wpi="http://schemas.microsoft.com/office/word/2010/wordprocessingInk" xmlns:wne="http://schemas.microsoft.com/office/word/2006/wordml" xmlns:wps="http://schemas.microsoft.com/office/word/2010/wordprocessingShape" mc:Ignorable="w14 w15 w16se w16cid w16 w16cex w16sdtdh w16sdtfl w16du wp14">
+<w:ftr xmlns:wpc="http://schemas.microsoft.com/office/word/2010/wordprocessingCanvas" xmlns:cx="http://schemas.microsoft.com/office/drawing/2014/chartex" xmlns:cx1="http://schemas.microsoft.com/office/drawing/2015/9/8/chartex" xmlns:cx2="http://schemas.microsoft.com/office/drawing/2015/10/21/chartex" xmlns:cx3="http://schemas.microsoft.com/office/drawing/2016/5/9/chartex" xmlns:cx4="http://schemas.microsoft.com/office/drawing/2016/5/10/chartex" xmlns:cx5="http://schemas.microsoft.com/office/drawing/2016/5/11/chartex" xmlns:cx6="http://schemas.microsoft.com/office/drawing/2016/5/12/chartex" xmlns:cx7="http://schemas.microsoft.com/office/drawing/2016/5/13/chartex" xmlns:cx8="http://schemas.microsoft.com/office/drawing/2016/5/14/chartex" xmlns:mc="http://schemas.openxmlformats.org/markup-compatibility/2006" xmlns:aink="http://schemas.microsoft.com/office/drawing/2016/ink" xmlns:am3d="http://schemas.microsoft.com/office/drawing/2017/model3d" xmlns:o="urn:schemas-microsoft-com:office:office" xmlns:oel="http://schemas.microsoft.com/office/2019/extlst" xmlns:r="http://schemas.openxmlformats.org/officeDocument/2006/relationships" xmlns:m="http://schemas.openxmlformats.org/officeDocument/2006/math" xmlns:v="urn:schemas-microsoft-com:vml" xmlns:wp14="http://schemas.microsoft.com/office/word/2010/wordprocessingDrawing" xmlns:wp="http://schemas.openxmlformats.org/drawingml/2006/wordprocessingDrawing" xmlns:w10="urn:schemas-microsoft-com:office:word" xmlns:w="http://schemas.openxmlformats.org/wordprocessingml/2006/main" xmlns:w14="http://schemas.microsoft.com/office/word/2010/wordml" xmlns:w15="http://schemas.microsoft.com/office/word/2012/wordml" xmlns:w16cex="http://schemas.microsoft.com/office/word/2018/wordml/cex" xmlns:w16cid="http://schemas.microsoft.com/office/word/2016/wordml/cid" xmlns:w16="http://schemas.microsoft.com/office/word/2018/wordml" xmlns:w16du="http://schemas.microsoft.com/office/word/2023/wordml/word16du" xmlns:w16sdtdh="http://schemas.microsoft.com/office/word/2020/wordml/sdtdatahash" xmlns:w16sdtfl="http://schemas.microsoft.com/office/word/2024/wordml/sdtformatlock" xmlns:w16se="http://schemas.microsoft.com/office/word/2015/wordml/symex" xmlns:wpg="http://schemas.microsoft.com/office/word/2010/wordprocessingGroup" xmlns:wpi="http://schemas.microsoft.com/office/word/2010/wordprocessingInk" xmlns:wne="http://schemas.microsoft.com/office/word/2006/wordml" xmlns:wps="http://schemas.microsoft.com/office/word/2010/wordprocessingShape" mc:Ignorable="w14 w15 w16se w16cid w16 w16cex w16sdtdh w16sdtfl w16du wp14">
   <w:p>
     <w:pPr>
       <w:pBdr>
@@ -19677,7 +20898,7 @@
 </file>
 
 <file path=word/footnotes.xml><?xml version="1.0" encoding="utf-8"?>
-<w:footnotes xmlns:wpc="http://schemas.microsoft.com/office/word/2010/wordprocessingCanvas" xmlns:cx="http://schemas.microsoft.com/office/drawing/2014/chartex" xmlns:cx1="http://schemas.microsoft.com/office/drawing/2015/9/8/chartex" xmlns:cx2="http://schemas.microsoft.com/office/drawing/2015/10/21/chartex" xmlns:cx3="http://schemas.microsoft.com/office/drawing/2016/5/9/chartex" xmlns:cx4="http://schemas.microsoft.com/office/drawing/2016/5/10/chartex" xmlns:cx5="http://schemas.microsoft.com/office/drawing/2016/5/11/chartex" xmlns:cx6="http://schemas.microsoft.com/office/drawing/2016/5/12/chartex" xmlns:cx7="http://schemas.microsoft.com/office/drawing/2016/5/13/chartex" xmlns:cx8="http://schemas.microsoft.com/office/drawing/2016/5/14/chartex" xmlns:mc="http://schemas.openxmlformats.org/markup-compatibility/2006" xmlns:aink="http://schemas.microsoft.com/office/drawing/2016/ink" xmlns:am3d="http://schemas.microsoft.com/office/drawing/2017/model3d" xmlns:o="urn:schemas-microsoft-com:office:office" xmlns:oel="http://schemas.microsoft.com/office/2019/extlst" xmlns:r="http://schemas.openxmlformats.org/officeDocument/2006/relationships" xmlns:m="http://schemas.openxmlformats.org/officeDocument/2006/math" xmlns:v="urn:schemas-microsoft-com:vml" xmlns:wp14="http://schemas.microsoft.com/office/word/2010/wordprocessingDrawing" xmlns:wp="http://schemas.openxmlformats.org/drawingml/2006/wordprocessingDrawing" xmlns:w10="urn:schemas-microsoft-com:office:word" xmlns:w="http://schemas.openxmlformats.org/wordprocessingml/2006/main" xmlns:w14="http://schemas.microsoft.com/office/word/2010/wordml" xmlns:w15="http://schemas.microsoft.com/office/word/2012/wordml" xmlns:w16cei="http://schemas.microsoft.com/office/word/2026/wordml/cei" xmlns:w16cex="http://schemas.microsoft.com/office/word/2018/wordml/cex" xmlns:w16cid="http://schemas.microsoft.com/office/word/2016/wordml/cid" xmlns:w16="http://schemas.microsoft.com/office/word/2018/wordml" xmlns:w16du="http://schemas.microsoft.com/office/word/2023/wordml/word16du" xmlns:w16sdtdh="http://schemas.microsoft.com/office/word/2020/wordml/sdtdatahash" xmlns:w16sdtfl="http://schemas.microsoft.com/office/word/2024/wordml/sdtformatlock" xmlns:w16se="http://schemas.microsoft.com/office/word/2015/wordml/symex" xmlns:wpg="http://schemas.microsoft.com/office/word/2010/wordprocessingGroup" xmlns:wpi="http://schemas.microsoft.com/office/word/2010/wordprocessingInk" xmlns:wne="http://schemas.microsoft.com/office/word/2006/wordml" xmlns:wps="http://schemas.microsoft.com/office/word/2010/wordprocessingShape" mc:Ignorable="w14 w15 w16se w16cid w16 w16cex w16sdtdh w16sdtfl w16du wp14">
+<w:footnotes xmlns:wpc="http://schemas.microsoft.com/office/word/2010/wordprocessingCanvas" xmlns:cx="http://schemas.microsoft.com/office/drawing/2014/chartex" xmlns:cx1="http://schemas.microsoft.com/office/drawing/2015/9/8/chartex" xmlns:cx2="http://schemas.microsoft.com/office/drawing/2015/10/21/chartex" xmlns:cx3="http://schemas.microsoft.com/office/drawing/2016/5/9/chartex" xmlns:cx4="http://schemas.microsoft.com/office/drawing/2016/5/10/chartex" xmlns:cx5="http://schemas.microsoft.com/office/drawing/2016/5/11/chartex" xmlns:cx6="http://schemas.microsoft.com/office/drawing/2016/5/12/chartex" xmlns:cx7="http://schemas.microsoft.com/office/drawing/2016/5/13/chartex" xmlns:cx8="http://schemas.microsoft.com/office/drawing/2016/5/14/chartex" xmlns:mc="http://schemas.openxmlformats.org/markup-compatibility/2006" xmlns:aink="http://schemas.microsoft.com/office/drawing/2016/ink" xmlns:am3d="http://schemas.microsoft.com/office/drawing/2017/model3d" xmlns:o="urn:schemas-microsoft-com:office:office" xmlns:oel="http://schemas.microsoft.com/office/2019/extlst" xmlns:r="http://schemas.openxmlformats.org/officeDocument/2006/relationships" xmlns:m="http://schemas.openxmlformats.org/officeDocument/2006/math" xmlns:v="urn:schemas-microsoft-com:vml" xmlns:wp14="http://schemas.microsoft.com/office/word/2010/wordprocessingDrawing" xmlns:wp="http://schemas.openxmlformats.org/drawingml/2006/wordprocessingDrawing" xmlns:w10="urn:schemas-microsoft-com:office:word" xmlns:w="http://schemas.openxmlformats.org/wordprocessingml/2006/main" xmlns:w14="http://schemas.microsoft.com/office/word/2010/wordml" xmlns:w15="http://schemas.microsoft.com/office/word/2012/wordml" xmlns:w16cex="http://schemas.microsoft.com/office/word/2018/wordml/cex" xmlns:w16cid="http://schemas.microsoft.com/office/word/2016/wordml/cid" xmlns:w16="http://schemas.microsoft.com/office/word/2018/wordml" xmlns:w16du="http://schemas.microsoft.com/office/word/2023/wordml/word16du" xmlns:w16sdtdh="http://schemas.microsoft.com/office/word/2020/wordml/sdtdatahash" xmlns:w16sdtfl="http://schemas.microsoft.com/office/word/2024/wordml/sdtformatlock" xmlns:w16se="http://schemas.microsoft.com/office/word/2015/wordml/symex" xmlns:wpg="http://schemas.microsoft.com/office/word/2010/wordprocessingGroup" xmlns:wpi="http://schemas.microsoft.com/office/word/2010/wordprocessingInk" xmlns:wne="http://schemas.microsoft.com/office/word/2006/wordml" xmlns:wps="http://schemas.microsoft.com/office/word/2010/wordprocessingShape" mc:Ignorable="w14 w15 w16se w16cid w16 w16cex w16sdtdh w16sdtfl w16du wp14">
   <w:footnote w:type="separator" w:id="-1">
     <w:p>
       <w:r>
@@ -19696,7 +20917,7 @@
 </file>
 
 <file path=word/header1.xml><?xml version="1.0" encoding="utf-8"?>
-<w:hdr xmlns:wpc="http://schemas.microsoft.com/office/word/2010/wordprocessingCanvas" xmlns:cx="http://schemas.microsoft.com/office/drawing/2014/chartex" xmlns:cx1="http://schemas.microsoft.com/office/drawing/2015/9/8/chartex" xmlns:cx2="http://schemas.microsoft.com/office/drawing/2015/10/21/chartex" xmlns:cx3="http://schemas.microsoft.com/office/drawing/2016/5/9/chartex" xmlns:cx4="http://schemas.microsoft.com/office/drawing/2016/5/10/chartex" xmlns:cx5="http://schemas.microsoft.com/office/drawing/2016/5/11/chartex" xmlns:cx6="http://schemas.microsoft.com/office/drawing/2016/5/12/chartex" xmlns:cx7="http://schemas.microsoft.com/office/drawing/2016/5/13/chartex" xmlns:cx8="http://schemas.microsoft.com/office/drawing/2016/5/14/chartex" xmlns:mc="http://schemas.openxmlformats.org/markup-compatibility/2006" xmlns:aink="http://schemas.microsoft.com/office/drawing/2016/ink" xmlns:am3d="http://schemas.microsoft.com/office/drawing/2017/model3d" xmlns:o="urn:schemas-microsoft-com:office:office" xmlns:oel="http://schemas.microsoft.com/office/2019/extlst" xmlns:r="http://schemas.openxmlformats.org/officeDocument/2006/relationships" xmlns:m="http://schemas.openxmlformats.org/officeDocument/2006/math" xmlns:v="urn:schemas-microsoft-com:vml" xmlns:wp14="http://schemas.microsoft.com/office/word/2010/wordprocessingDrawing" xmlns:wp="http://schemas.openxmlformats.org/drawingml/2006/wordprocessingDrawing" xmlns:w10="urn:schemas-microsoft-com:office:word" xmlns:w="http://schemas.openxmlformats.org/wordprocessingml/2006/main" xmlns:w14="http://schemas.microsoft.com/office/word/2010/wordml" xmlns:w15="http://schemas.microsoft.com/office/word/2012/wordml" xmlns:w16cei="http://schemas.microsoft.com/office/word/2026/wordml/cei" xmlns:w16cex="http://schemas.microsoft.com/office/word/2018/wordml/cex" xmlns:w16cid="http://schemas.microsoft.com/office/word/2016/wordml/cid" xmlns:w16="http://schemas.microsoft.com/office/word/2018/wordml" xmlns:w16du="http://schemas.microsoft.com/office/word/2023/wordml/word16du" xmlns:w16sdtdh="http://schemas.microsoft.com/office/word/2020/wordml/sdtdatahash" xmlns:w16sdtfl="http://schemas.microsoft.com/office/word/2024/wordml/sdtformatlock" xmlns:w16se="http://schemas.microsoft.com/office/word/2015/wordml/symex" xmlns:wpg="http://schemas.microsoft.com/office/word/2010/wordprocessingGroup" xmlns:wpi="http://schemas.microsoft.com/office/word/2010/wordprocessingInk" xmlns:wne="http://schemas.microsoft.com/office/word/2006/wordml" xmlns:wps="http://schemas.microsoft.com/office/word/2010/wordprocessingShape" mc:Ignorable="w14 w15 w16se w16cid w16 w16cex w16sdtdh w16sdtfl w16du wp14">
+<w:hdr xmlns:wpc="http://schemas.microsoft.com/office/word/2010/wordprocessingCanvas" xmlns:cx="http://schemas.microsoft.com/office/drawing/2014/chartex" xmlns:cx1="http://schemas.microsoft.com/office/drawing/2015/9/8/chartex" xmlns:cx2="http://schemas.microsoft.com/office/drawing/2015/10/21/chartex" xmlns:cx3="http://schemas.microsoft.com/office/drawing/2016/5/9/chartex" xmlns:cx4="http://schemas.microsoft.com/office/drawing/2016/5/10/chartex" xmlns:cx5="http://schemas.microsoft.com/office/drawing/2016/5/11/chartex" xmlns:cx6="http://schemas.microsoft.com/office/drawing/2016/5/12/chartex" xmlns:cx7="http://schemas.microsoft.com/office/drawing/2016/5/13/chartex" xmlns:cx8="http://schemas.microsoft.com/office/drawing/2016/5/14/chartex" xmlns:mc="http://schemas.openxmlformats.org/markup-compatibility/2006" xmlns:aink="http://schemas.microsoft.com/office/drawing/2016/ink" xmlns:am3d="http://schemas.microsoft.com/office/drawing/2017/model3d" xmlns:o="urn:schemas-microsoft-com:office:office" xmlns:oel="http://schemas.microsoft.com/office/2019/extlst" xmlns:r="http://schemas.openxmlformats.org/officeDocument/2006/relationships" xmlns:m="http://schemas.openxmlformats.org/officeDocument/2006/math" xmlns:v="urn:schemas-microsoft-com:vml" xmlns:wp14="http://schemas.microsoft.com/office/word/2010/wordprocessingDrawing" xmlns:wp="http://schemas.openxmlformats.org/drawingml/2006/wordprocessingDrawing" xmlns:w10="urn:schemas-microsoft-com:office:word" xmlns:w="http://schemas.openxmlformats.org/wordprocessingml/2006/main" xmlns:w14="http://schemas.microsoft.com/office/word/2010/wordml" xmlns:w15="http://schemas.microsoft.com/office/word/2012/wordml" xmlns:w16cex="http://schemas.microsoft.com/office/word/2018/wordml/cex" xmlns:w16cid="http://schemas.microsoft.com/office/word/2016/wordml/cid" xmlns:w16="http://schemas.microsoft.com/office/word/2018/wordml" xmlns:w16du="http://schemas.microsoft.com/office/word/2023/wordml/word16du" xmlns:w16sdtdh="http://schemas.microsoft.com/office/word/2020/wordml/sdtdatahash" xmlns:w16sdtfl="http://schemas.microsoft.com/office/word/2024/wordml/sdtformatlock" xmlns:w16se="http://schemas.microsoft.com/office/word/2015/wordml/symex" xmlns:wpg="http://schemas.microsoft.com/office/word/2010/wordprocessingGroup" xmlns:wpi="http://schemas.microsoft.com/office/word/2010/wordprocessingInk" xmlns:wne="http://schemas.microsoft.com/office/word/2006/wordml" xmlns:wps="http://schemas.microsoft.com/office/word/2010/wordprocessingShape" mc:Ignorable="w14 w15 w16se w16cid w16 w16cex w16sdtdh w16sdtfl w16du wp14">
   <w:p>
     <w:pPr>
       <w:pBdr>
@@ -19743,7 +20964,7 @@
 </file>
 
 <file path=word/header2.xml><?xml version="1.0" encoding="utf-8"?>
-<w:hdr xmlns:wpc="http://schemas.microsoft.com/office/word/2010/wordprocessingCanvas" xmlns:cx="http://schemas.microsoft.com/office/drawing/2014/chartex" xmlns:cx1="http://schemas.microsoft.com/office/drawing/2015/9/8/chartex" xmlns:cx2="http://schemas.microsoft.com/office/drawing/2015/10/21/chartex" xmlns:cx3="http://schemas.microsoft.com/office/drawing/2016/5/9/chartex" xmlns:cx4="http://schemas.microsoft.com/office/drawing/2016/5/10/chartex" xmlns:cx5="http://schemas.microsoft.com/office/drawing/2016/5/11/chartex" xmlns:cx6="http://schemas.microsoft.com/office/drawing/2016/5/12/chartex" xmlns:cx7="http://schemas.microsoft.com/office/drawing/2016/5/13/chartex" xmlns:cx8="http://schemas.microsoft.com/office/drawing/2016/5/14/chartex" xmlns:mc="http://schemas.openxmlformats.org/markup-compatibility/2006" xmlns:aink="http://schemas.microsoft.com/office/drawing/2016/ink" xmlns:am3d="http://schemas.microsoft.com/office/drawing/2017/model3d" xmlns:o="urn:schemas-microsoft-com:office:office" xmlns:oel="http://schemas.microsoft.com/office/2019/extlst" xmlns:r="http://schemas.openxmlformats.org/officeDocument/2006/relationships" xmlns:m="http://schemas.openxmlformats.org/officeDocument/2006/math" xmlns:v="urn:schemas-microsoft-com:vml" xmlns:wp14="http://schemas.microsoft.com/office/word/2010/wordprocessingDrawing" xmlns:wp="http://schemas.openxmlformats.org/drawingml/2006/wordprocessingDrawing" xmlns:w10="urn:schemas-microsoft-com:office:word" xmlns:w="http://schemas.openxmlformats.org/wordprocessingml/2006/main" xmlns:w14="http://schemas.microsoft.com/office/word/2010/wordml" xmlns:w15="http://schemas.microsoft.com/office/word/2012/wordml" xmlns:w16cei="http://schemas.microsoft.com/office/word/2026/wordml/cei" xmlns:w16cex="http://schemas.microsoft.com/office/word/2018/wordml/cex" xmlns:w16cid="http://schemas.microsoft.com/office/word/2016/wordml/cid" xmlns:w16="http://schemas.microsoft.com/office/word/2018/wordml" xmlns:w16du="http://schemas.microsoft.com/office/word/2023/wordml/word16du" xmlns:w16sdtdh="http://schemas.microsoft.com/office/word/2020/wordml/sdtdatahash" xmlns:w16sdtfl="http://schemas.microsoft.com/office/word/2024/wordml/sdtformatlock" xmlns:w16se="http://schemas.microsoft.com/office/word/2015/wordml/symex" xmlns:wpg="http://schemas.microsoft.com/office/word/2010/wordprocessingGroup" xmlns:wpi="http://schemas.microsoft.com/office/word/2010/wordprocessingInk" xmlns:wne="http://schemas.microsoft.com/office/word/2006/wordml" xmlns:wps="http://schemas.microsoft.com/office/word/2010/wordprocessingShape" mc:Ignorable="w14 w15 w16se w16cid w16 w16cex w16sdtdh w16sdtfl w16du wp14">
+<w:hdr xmlns:wpc="http://schemas.microsoft.com/office/word/2010/wordprocessingCanvas" xmlns:cx="http://schemas.microsoft.com/office/drawing/2014/chartex" xmlns:cx1="http://schemas.microsoft.com/office/drawing/2015/9/8/chartex" xmlns:cx2="http://schemas.microsoft.com/office/drawing/2015/10/21/chartex" xmlns:cx3="http://schemas.microsoft.com/office/drawing/2016/5/9/chartex" xmlns:cx4="http://schemas.microsoft.com/office/drawing/2016/5/10/chartex" xmlns:cx5="http://schemas.microsoft.com/office/drawing/2016/5/11/chartex" xmlns:cx6="http://schemas.microsoft.com/office/drawing/2016/5/12/chartex" xmlns:cx7="http://schemas.microsoft.com/office/drawing/2016/5/13/chartex" xmlns:cx8="http://schemas.microsoft.com/office/drawing/2016/5/14/chartex" xmlns:mc="http://schemas.openxmlformats.org/markup-compatibility/2006" xmlns:aink="http://schemas.microsoft.com/office/drawing/2016/ink" xmlns:am3d="http://schemas.microsoft.com/office/drawing/2017/model3d" xmlns:o="urn:schemas-microsoft-com:office:office" xmlns:oel="http://schemas.microsoft.com/office/2019/extlst" xmlns:r="http://schemas.openxmlformats.org/officeDocument/2006/relationships" xmlns:m="http://schemas.openxmlformats.org/officeDocument/2006/math" xmlns:v="urn:schemas-microsoft-com:vml" xmlns:wp14="http://schemas.microsoft.com/office/word/2010/wordprocessingDrawing" xmlns:wp="http://schemas.openxmlformats.org/drawingml/2006/wordprocessingDrawing" xmlns:w10="urn:schemas-microsoft-com:office:word" xmlns:w="http://schemas.openxmlformats.org/wordprocessingml/2006/main" xmlns:w14="http://schemas.microsoft.com/office/word/2010/wordml" xmlns:w15="http://schemas.microsoft.com/office/word/2012/wordml" xmlns:w16cex="http://schemas.microsoft.com/office/word/2018/wordml/cex" xmlns:w16cid="http://schemas.microsoft.com/office/word/2016/wordml/cid" xmlns:w16="http://schemas.microsoft.com/office/word/2018/wordml" xmlns:w16du="http://schemas.microsoft.com/office/word/2023/wordml/word16du" xmlns:w16sdtdh="http://schemas.microsoft.com/office/word/2020/wordml/sdtdatahash" xmlns:w16sdtfl="http://schemas.microsoft.com/office/word/2024/wordml/sdtformatlock" xmlns:w16se="http://schemas.microsoft.com/office/word/2015/wordml/symex" xmlns:wpg="http://schemas.microsoft.com/office/word/2010/wordprocessingGroup" xmlns:wpi="http://schemas.microsoft.com/office/word/2010/wordprocessingInk" xmlns:wne="http://schemas.microsoft.com/office/word/2006/wordml" xmlns:wps="http://schemas.microsoft.com/office/word/2010/wordprocessingShape" mc:Ignorable="w14 w15 w16se w16cid w16 w16cex w16sdtdh w16sdtfl w16du wp14">
   <w:p>
     <w:pPr>
       <w:pBdr>
@@ -19769,7 +20990,7 @@
 </file>
 
 <file path=word/header3.xml><?xml version="1.0" encoding="utf-8"?>
-<w:hdr xmlns:wpc="http://schemas.microsoft.com/office/word/2010/wordprocessingCanvas" xmlns:cx="http://schemas.microsoft.com/office/drawing/2014/chartex" xmlns:cx1="http://schemas.microsoft.com/office/drawing/2015/9/8/chartex" xmlns:cx2="http://schemas.microsoft.com/office/drawing/2015/10/21/chartex" xmlns:cx3="http://schemas.microsoft.com/office/drawing/2016/5/9/chartex" xmlns:cx4="http://schemas.microsoft.com/office/drawing/2016/5/10/chartex" xmlns:cx5="http://schemas.microsoft.com/office/drawing/2016/5/11/chartex" xmlns:cx6="http://schemas.microsoft.com/office/drawing/2016/5/12/chartex" xmlns:cx7="http://schemas.microsoft.com/office/drawing/2016/5/13/chartex" xmlns:cx8="http://schemas.microsoft.com/office/drawing/2016/5/14/chartex" xmlns:mc="http://schemas.openxmlformats.org/markup-compatibility/2006" xmlns:aink="http://schemas.microsoft.com/office/drawing/2016/ink" xmlns:am3d="http://schemas.microsoft.com/office/drawing/2017/model3d" xmlns:o="urn:schemas-microsoft-com:office:office" xmlns:oel="http://schemas.microsoft.com/office/2019/extlst" xmlns:r="http://schemas.openxmlformats.org/officeDocument/2006/relationships" xmlns:m="http://schemas.openxmlformats.org/officeDocument/2006/math" xmlns:v="urn:schemas-microsoft-com:vml" xmlns:wp14="http://schemas.microsoft.com/office/word/2010/wordprocessingDrawing" xmlns:wp="http://schemas.openxmlformats.org/drawingml/2006/wordprocessingDrawing" xmlns:w10="urn:schemas-microsoft-com:office:word" xmlns:w="http://schemas.openxmlformats.org/wordprocessingml/2006/main" xmlns:w14="http://schemas.microsoft.com/office/word/2010/wordml" xmlns:w15="http://schemas.microsoft.com/office/word/2012/wordml" xmlns:w16cei="http://schemas.microsoft.com/office/word/2026/wordml/cei" xmlns:w16cex="http://schemas.microsoft.com/office/word/2018/wordml/cex" xmlns:w16cid="http://schemas.microsoft.com/office/word/2016/wordml/cid" xmlns:w16="http://schemas.microsoft.com/office/word/2018/wordml" xmlns:w16du="http://schemas.microsoft.com/office/word/2023/wordml/word16du" xmlns:w16sdtdh="http://schemas.microsoft.com/office/word/2020/wordml/sdtdatahash" xmlns:w16sdtfl="http://schemas.microsoft.com/office/word/2024/wordml/sdtformatlock" xmlns:w16se="http://schemas.microsoft.com/office/word/2015/wordml/symex" xmlns:wpg="http://schemas.microsoft.com/office/word/2010/wordprocessingGroup" xmlns:wpi="http://schemas.microsoft.com/office/word/2010/wordprocessingInk" xmlns:wne="http://schemas.microsoft.com/office/word/2006/wordml" xmlns:wps="http://schemas.microsoft.com/office/word/2010/wordprocessingShape" mc:Ignorable="w14 w15 w16se w16cid w16 w16cex w16sdtdh w16sdtfl w16du wp14">
+<w:hdr xmlns:wpc="http://schemas.microsoft.com/office/word/2010/wordprocessingCanvas" xmlns:cx="http://schemas.microsoft.com/office/drawing/2014/chartex" xmlns:cx1="http://schemas.microsoft.com/office/drawing/2015/9/8/chartex" xmlns:cx2="http://schemas.microsoft.com/office/drawing/2015/10/21/chartex" xmlns:cx3="http://schemas.microsoft.com/office/drawing/2016/5/9/chartex" xmlns:cx4="http://schemas.microsoft.com/office/drawing/2016/5/10/chartex" xmlns:cx5="http://schemas.microsoft.com/office/drawing/2016/5/11/chartex" xmlns:cx6="http://schemas.microsoft.com/office/drawing/2016/5/12/chartex" xmlns:cx7="http://schemas.microsoft.com/office/drawing/2016/5/13/chartex" xmlns:cx8="http://schemas.microsoft.com/office/drawing/2016/5/14/chartex" xmlns:mc="http://schemas.openxmlformats.org/markup-compatibility/2006" xmlns:aink="http://schemas.microsoft.com/office/drawing/2016/ink" xmlns:am3d="http://schemas.microsoft.com/office/drawing/2017/model3d" xmlns:o="urn:schemas-microsoft-com:office:office" xmlns:oel="http://schemas.microsoft.com/office/2019/extlst" xmlns:r="http://schemas.openxmlformats.org/officeDocument/2006/relationships" xmlns:m="http://schemas.openxmlformats.org/officeDocument/2006/math" xmlns:v="urn:schemas-microsoft-com:vml" xmlns:wp14="http://schemas.microsoft.com/office/word/2010/wordprocessingDrawing" xmlns:wp="http://schemas.openxmlformats.org/drawingml/2006/wordprocessingDrawing" xmlns:w10="urn:schemas-microsoft-com:office:word" xmlns:w="http://schemas.openxmlformats.org/wordprocessingml/2006/main" xmlns:w14="http://schemas.microsoft.com/office/word/2010/wordml" xmlns:w15="http://schemas.microsoft.com/office/word/2012/wordml" xmlns:w16cex="http://schemas.microsoft.com/office/word/2018/wordml/cex" xmlns:w16cid="http://schemas.microsoft.com/office/word/2016/wordml/cid" xmlns:w16="http://schemas.microsoft.com/office/word/2018/wordml" xmlns:w16du="http://schemas.microsoft.com/office/word/2023/wordml/word16du" xmlns:w16sdtdh="http://schemas.microsoft.com/office/word/2020/wordml/sdtdatahash" xmlns:w16sdtfl="http://schemas.microsoft.com/office/word/2024/wordml/sdtformatlock" xmlns:w16se="http://schemas.microsoft.com/office/word/2015/wordml/symex" xmlns:wpg="http://schemas.microsoft.com/office/word/2010/wordprocessingGroup" xmlns:wpi="http://schemas.microsoft.com/office/word/2010/wordprocessingInk" xmlns:wne="http://schemas.microsoft.com/office/word/2006/wordml" xmlns:wps="http://schemas.microsoft.com/office/word/2010/wordprocessingShape" mc:Ignorable="w14 w15 w16se w16cid w16 w16cex w16sdtdh w16sdtfl w16du wp14">
   <w:p>
     <w:pPr>
       <w:pBdr>
@@ -19827,7 +21048,7 @@
 </file>
 
 <file path=word/numbering.xml><?xml version="1.0" encoding="utf-8"?>
-<w:numbering xmlns:wpc="http://schemas.microsoft.com/office/word/2010/wordprocessingCanvas" xmlns:cx="http://schemas.microsoft.com/office/drawing/2014/chartex" xmlns:cx1="http://schemas.microsoft.com/office/drawing/2015/9/8/chartex" xmlns:cx2="http://schemas.microsoft.com/office/drawing/2015/10/21/chartex" xmlns:cx3="http://schemas.microsoft.com/office/drawing/2016/5/9/chartex" xmlns:cx4="http://schemas.microsoft.com/office/drawing/2016/5/10/chartex" xmlns:cx5="http://schemas.microsoft.com/office/drawing/2016/5/11/chartex" xmlns:cx6="http://schemas.microsoft.com/office/drawing/2016/5/12/chartex" xmlns:cx7="http://schemas.microsoft.com/office/drawing/2016/5/13/chartex" xmlns:cx8="http://schemas.microsoft.com/office/drawing/2016/5/14/chartex" xmlns:mc="http://schemas.openxmlformats.org/markup-compatibility/2006" xmlns:aink="http://schemas.microsoft.com/office/drawing/2016/ink" xmlns:am3d="http://schemas.microsoft.com/office/drawing/2017/model3d" xmlns:o="urn:schemas-microsoft-com:office:office" xmlns:oel="http://schemas.microsoft.com/office/2019/extlst" xmlns:r="http://schemas.openxmlformats.org/officeDocument/2006/relationships" xmlns:m="http://schemas.openxmlformats.org/officeDocument/2006/math" xmlns:v="urn:schemas-microsoft-com:vml" xmlns:wp14="http://schemas.microsoft.com/office/word/2010/wordprocessingDrawing" xmlns:wp="http://schemas.openxmlformats.org/drawingml/2006/wordprocessingDrawing" xmlns:w10="urn:schemas-microsoft-com:office:word" xmlns:w="http://schemas.openxmlformats.org/wordprocessingml/2006/main" xmlns:w14="http://schemas.microsoft.com/office/word/2010/wordml" xmlns:w15="http://schemas.microsoft.com/office/word/2012/wordml" xmlns:w16cei="http://schemas.microsoft.com/office/word/2026/wordml/cei" xmlns:w16cex="http://schemas.microsoft.com/office/word/2018/wordml/cex" xmlns:w16cid="http://schemas.microsoft.com/office/word/2016/wordml/cid" xmlns:w16="http://schemas.microsoft.com/office/word/2018/wordml" xmlns:w16du="http://schemas.microsoft.com/office/word/2023/wordml/word16du" xmlns:w16sdtdh="http://schemas.microsoft.com/office/word/2020/wordml/sdtdatahash" xmlns:w16sdtfl="http://schemas.microsoft.com/office/word/2024/wordml/sdtformatlock" xmlns:w16se="http://schemas.microsoft.com/office/word/2015/wordml/symex" xmlns:wpg="http://schemas.microsoft.com/office/word/2010/wordprocessingGroup" xmlns:wpi="http://schemas.microsoft.com/office/word/2010/wordprocessingInk" xmlns:wne="http://schemas.microsoft.com/office/word/2006/wordml" xmlns:wps="http://schemas.microsoft.com/office/word/2010/wordprocessingShape" mc:Ignorable="w14 w15 w16se w16cid w16 w16cex w16sdtdh w16sdtfl w16du wp14">
+<w:numbering xmlns:wpc="http://schemas.microsoft.com/office/word/2010/wordprocessingCanvas" xmlns:cx="http://schemas.microsoft.com/office/drawing/2014/chartex" xmlns:cx1="http://schemas.microsoft.com/office/drawing/2015/9/8/chartex" xmlns:cx2="http://schemas.microsoft.com/office/drawing/2015/10/21/chartex" xmlns:cx3="http://schemas.microsoft.com/office/drawing/2016/5/9/chartex" xmlns:cx4="http://schemas.microsoft.com/office/drawing/2016/5/10/chartex" xmlns:cx5="http://schemas.microsoft.com/office/drawing/2016/5/11/chartex" xmlns:cx6="http://schemas.microsoft.com/office/drawing/2016/5/12/chartex" xmlns:cx7="http://schemas.microsoft.com/office/drawing/2016/5/13/chartex" xmlns:cx8="http://schemas.microsoft.com/office/drawing/2016/5/14/chartex" xmlns:mc="http://schemas.openxmlformats.org/markup-compatibility/2006" xmlns:aink="http://schemas.microsoft.com/office/drawing/2016/ink" xmlns:am3d="http://schemas.microsoft.com/office/drawing/2017/model3d" xmlns:o="urn:schemas-microsoft-com:office:office" xmlns:oel="http://schemas.microsoft.com/office/2019/extlst" xmlns:r="http://schemas.openxmlformats.org/officeDocument/2006/relationships" xmlns:m="http://schemas.openxmlformats.org/officeDocument/2006/math" xmlns:v="urn:schemas-microsoft-com:vml" xmlns:wp14="http://schemas.microsoft.com/office/word/2010/wordprocessingDrawing" xmlns:wp="http://schemas.openxmlformats.org/drawingml/2006/wordprocessingDrawing" xmlns:w10="urn:schemas-microsoft-com:office:word" xmlns:w="http://schemas.openxmlformats.org/wordprocessingml/2006/main" xmlns:w14="http://schemas.microsoft.com/office/word/2010/wordml" xmlns:w15="http://schemas.microsoft.com/office/word/2012/wordml" xmlns:w16cex="http://schemas.microsoft.com/office/word/2018/wordml/cex" xmlns:w16cid="http://schemas.microsoft.com/office/word/2016/wordml/cid" xmlns:w16="http://schemas.microsoft.com/office/word/2018/wordml" xmlns:w16du="http://schemas.microsoft.com/office/word/2023/wordml/word16du" xmlns:w16sdtdh="http://schemas.microsoft.com/office/word/2020/wordml/sdtdatahash" xmlns:w16sdtfl="http://schemas.microsoft.com/office/word/2024/wordml/sdtformatlock" xmlns:w16se="http://schemas.microsoft.com/office/word/2015/wordml/symex" xmlns:wpg="http://schemas.microsoft.com/office/word/2010/wordprocessingGroup" xmlns:wpi="http://schemas.microsoft.com/office/word/2010/wordprocessingInk" xmlns:wne="http://schemas.microsoft.com/office/word/2006/wordml" xmlns:wps="http://schemas.microsoft.com/office/word/2010/wordprocessingShape" mc:Ignorable="w14 w15 w16se w16cid w16 w16cex w16sdtdh w16sdtfl w16du wp14">
   <w:abstractNum w:abstractNumId="0" w15:restartNumberingAfterBreak="0">
     <w:nsid w:val="0016019A"/>
     <w:multiLevelType w:val="multilevel"/>
@@ -27018,6 +28239,7 @@
   <w:style w:type="character" w:default="1" w:styleId="DefaultParagraphFont">
     <w:name w:val="Default Paragraph Font"/>
     <w:uiPriority w:val="1"/>
+    <w:semiHidden/>
     <w:unhideWhenUsed/>
   </w:style>
   <w:style w:type="table" w:default="1" w:styleId="TableNormal">
@@ -27503,4 +28725,16 @@
   </a:objectDefaults>
   <a:extraClrSchemeLst/>
 </a:theme>
+</file>
+
+<file path=customXml/item1.xml><?xml version="1.0" encoding="utf-8"?>
+<b:Sources xmlns:b="http://schemas.openxmlformats.org/officeDocument/2006/bibliography" xmlns="http://schemas.openxmlformats.org/officeDocument/2006/bibliography" SelectedStyle="\APASixthEditionOfficeOnline.xsl" StyleName="APA" Version="6"/>
+</file>
+
+<file path=customXml/itemProps1.xml><?xml version="1.0" encoding="utf-8"?>
+<ds:datastoreItem xmlns:ds="http://schemas.openxmlformats.org/officeDocument/2006/customXml" ds:itemID="{699C07C6-9C8B-4CE5-8465-99CC702B3E9C}">
+  <ds:schemaRefs>
+    <ds:schemaRef ds:uri="http://schemas.openxmlformats.org/officeDocument/2006/bibliography"/>
+  </ds:schemaRefs>
+</ds:datastoreItem>
 </file>
</xml_diff>